<commit_message>
Revisa roteiros: remove associacao guampa/chifre/chimarrao, adiciona Parabens Gauderio, apetite appeal e ocasiao de consumo
</commit_message>
<xml_diff>
--- a/Roteiro_Situacoes_Tipicas_Gauchas_Santa_Massa.docx
+++ b/Roteiro_Situacoes_Tipicas_Gauchas_Santa_Massa.docx
@@ -59,7 +59,7 @@
           <w:iCs/>
           <w:color w:val="555555"/>
         </w:rPr>
-        <w:t xml:space="preserve">Bloco: "Situações Típicas Gaúchas" — cruzando gauchismos (gírias regionais) com o churrasco de espeto e o dia a dia gaúcho. Gravação em casa ou em locais públicos simples, antes do Acampamento Farroupilha.</w:t>
+        <w:t xml:space="preserve">Bloco: "Situações Típicas Gaúchas" — cada vídeo parte de uma ocasião de consumo real e distinta (não só churrasco), sempre evidenciando o apetite appeal do produto e um traço da cultura gaúcha. Gravação em casa ou em locais públicos simples, antes do Acampamento Farroupilha.</w:t>
       </w:r>
     </w:p>
     <w:p>
@@ -89,7 +89,7 @@
         <w:rPr>
           <w:color w:val="1A1A1A"/>
         </w:rPr>
-        <w:t xml:space="preserve">Nos conteúdos da Santa Massa, é essencial que o pão apareça sempre douradinho, com recheio visível e apetitoso, sem estar queimado ou pálido.</w:t>
+        <w:t xml:space="preserve">Nos conteúdos da Santa Massa, é essencial que o pão e a farofa apareçam sempre com aparência fresca e apetitosa (douradinho, recheio visível, crocância evidente), sem estar queimado, pálido ou murcho.</w:t>
       </w:r>
     </w:p>
     <w:p>
@@ -105,7 +105,23 @@
         <w:rPr>
           <w:color w:val="1A1A1A"/>
         </w:rPr>
-        <w:t xml:space="preserve">As imagens do produto, sejam fotos ou vídeos, devem ser feitas imediatamente após o preparo, garantindo que a crocância esteja preservada. Caso o produto fique exposto por algum tempo, assar/preparar uma nova unidade antes de seguir com a captura.</w:t>
+        <w:t xml:space="preserve">Cada vídeo deve evidenciar o apetite appeal do produto (textura, vapor, brilho, queijo escorrendo, som de crocância) e deixar clara a ocasião de consumo — quando, com quem e por que se come aquilo.</w:t>
+      </w:r>
+    </w:p>
+    <w:p>
+      <w:pPr>
+        <w:pStyle w:val="ListParagraph"/>
+        <w:numPr>
+          <w:ilvl w:val="0"/>
+          <w:numId w:val="2"/>
+        </w:numPr>
+        <w:spacing w:after="60"/>
+      </w:pPr>
+      <w:r>
+        <w:rPr>
+          <w:color w:val="1A1A1A"/>
+        </w:rPr>
+        <w:t xml:space="preserve">As imagens do produto, sejam fotos ou vídeos, devem ser feitas imediatamente após o preparo. Caso o produto fique exposto por algum tempo, preparar uma nova unidade antes de seguir com a captura.</w:t>
       </w:r>
     </w:p>
     <w:p>
@@ -169,7 +185,7 @@
         <w:rPr>
           <w:color w:val="1A1A1A"/>
         </w:rPr>
-        <w:t xml:space="preserve">Como a gravação será em casa ou em local público (não no Acampamento Farroupilha), priorizar ambientes bem iluminados, limpos e organizados, evitando elementos que revelem que a cena não é o piquete (ex: eletrodomésticos de cozinha em plano muito aberto, decoração claramente doméstica em close).</w:t>
+        <w:t xml:space="preserve">Como a gravação será em casa ou em local público (não no Acampamento Farroupilha), priorizar ambientes bem iluminados, limpos e organizados, evitando elementos que revelem claramente que a cena não é o piquete.</w:t>
       </w:r>
     </w:p>
     <w:p>
@@ -185,7 +201,7 @@
         <w:rPr>
           <w:color w:val="1A1A1A"/>
         </w:rPr>
-        <w:t xml:space="preserve">Cada vídeo deve ser gravado em um ambiente/enquadramento diferente dentro de casa (churrasqueira/varanda, mesa, bancada) para manter o conteúdo dinâmico e evitar repetição visual.</w:t>
+        <w:t xml:space="preserve">Cada vídeo deve ser gravado em um ambiente/enquadramento diferente dentro de casa para manter o conteúdo dinâmico e evitar repetição visual — e cada situação deve trazer uma ocasião de consumo distinta (não repetir sempre o contexto de churrasco).</w:t>
       </w:r>
     </w:p>
     <w:p>
@@ -201,7 +217,7 @@
         <w:rPr>
           <w:color w:val="1A1A1A"/>
         </w:rPr>
-        <w:t xml:space="preserve">As gírias gaúchas usadas nos letterings devem aparecer sempre com a tradução/explicação em português comum, para não excluir quem não é do Rio Grande do Sul.</w:t>
+        <w:t xml:space="preserve">As gírias gaúchas usadas nos letterings devem aparecer com clareza de sentido pelo contexto da cena, mesmo sem tradução literal na tela, para não quebrar o tom natural do vídeo.</w:t>
       </w:r>
     </w:p>
     <w:p>
@@ -257,19 +273,6 @@
     </w:p>
     <w:p>
       <w:pPr>
-        <w:spacing w:after="120"/>
-      </w:pPr>
-      <w:r>
-        <w:rPr>
-          <w:i/>
-          <w:iCs/>
-          <w:color w:val="555555"/>
-        </w:rPr>
-        <w:t xml:space="preserve">Levantado a partir de conteúdo de referência sobre gírias do Rio Grande do Sul; usado como base para os letterings dos vídeos abaixo.</w:t>
-      </w:r>
-    </w:p>
-    <w:p>
-      <w:pPr>
         <w:pStyle w:val="ListParagraph"/>
         <w:numPr>
           <w:ilvl w:val="0"/>
@@ -281,7 +284,7 @@
         <w:rPr>
           <w:color w:val="1A1A1A"/>
         </w:rPr>
-        <w:t xml:space="preserve">GUAMPA — Chifre — também é o nome do copo de chimarrão feito de chifre de boi.</w:t>
+        <w:t xml:space="preserve">FACEIRO — Feliz, satisfeito, orgulhoso do resultado.</w:t>
       </w:r>
     </w:p>
     <w:p>
@@ -297,7 +300,7 @@
         <w:rPr>
           <w:color w:val="1A1A1A"/>
         </w:rPr>
-        <w:t xml:space="preserve">CHINELAGEM — Sacanagem, brincadeira de mau gosto.</w:t>
+        <w:t xml:space="preserve">PILA — Dinheiro, real (ex: "vale uma pila" = vale a pena, é barato pelo que entrega).</w:t>
       </w:r>
     </w:p>
     <w:p>
@@ -313,7 +316,7 @@
         <w:rPr>
           <w:color w:val="1A1A1A"/>
         </w:rPr>
-        <w:t xml:space="preserve">SANGA — Vala, valeta, pequeno curso d'água no campo.</w:t>
+        <w:t xml:space="preserve">SESTEAR / SESTEADA — Tirar uma soneca, cochilo — geralmente depois de uma refeição farta.</w:t>
       </w:r>
     </w:p>
     <w:p>
@@ -329,103 +332,7 @@
         <w:rPr>
           <w:color w:val="1A1A1A"/>
         </w:rPr>
-        <w:t xml:space="preserve">CUSCO — Cachorro (geralmente pequeno/vira-lata).</w:t>
-      </w:r>
-    </w:p>
-    <w:p>
-      <w:pPr>
-        <w:pStyle w:val="ListParagraph"/>
-        <w:numPr>
-          <w:ilvl w:val="0"/>
-          <w:numId w:val="2"/>
-        </w:numPr>
-        <w:spacing w:after="60"/>
-      </w:pPr>
-      <w:r>
-        <w:rPr>
-          <w:color w:val="1A1A1A"/>
-        </w:rPr>
-        <w:t xml:space="preserve">PILA — Dinheiro, real (ex: "10 pila" = R$10).</w:t>
-      </w:r>
-    </w:p>
-    <w:p>
-      <w:pPr>
-        <w:pStyle w:val="ListParagraph"/>
-        <w:numPr>
-          <w:ilvl w:val="0"/>
-          <w:numId w:val="2"/>
-        </w:numPr>
-        <w:spacing w:after="60"/>
-      </w:pPr>
-      <w:r>
-        <w:rPr>
-          <w:color w:val="1A1A1A"/>
-        </w:rPr>
-        <w:t xml:space="preserve">BRIGADIANO — Policial militar (referência à Brigada Militar do RS).</w:t>
-      </w:r>
-    </w:p>
-    <w:p>
-      <w:pPr>
-        <w:pStyle w:val="ListParagraph"/>
-        <w:numPr>
-          <w:ilvl w:val="0"/>
-          <w:numId w:val="2"/>
-        </w:numPr>
-        <w:spacing w:after="60"/>
-      </w:pPr>
-      <w:r>
-        <w:rPr>
-          <w:color w:val="1A1A1A"/>
-        </w:rPr>
-        <w:t xml:space="preserve">SESTEAR / SESTEADA — Tirar uma soneca, cochilo — geralmente após o almoço.</w:t>
-      </w:r>
-    </w:p>
-    <w:p>
-      <w:pPr>
-        <w:pStyle w:val="ListParagraph"/>
-        <w:numPr>
-          <w:ilvl w:val="0"/>
-          <w:numId w:val="2"/>
-        </w:numPr>
-        <w:spacing w:after="60"/>
-      </w:pPr>
-      <w:r>
-        <w:rPr>
-          <w:color w:val="1A1A1A"/>
-        </w:rPr>
-        <w:t xml:space="preserve">CHAVEAR — Trancar com chave.</w:t>
-      </w:r>
-    </w:p>
-    <w:p>
-      <w:pPr>
-        <w:pStyle w:val="ListParagraph"/>
-        <w:numPr>
-          <w:ilvl w:val="0"/>
-          <w:numId w:val="2"/>
-        </w:numPr>
-        <w:spacing w:after="60"/>
-      </w:pPr>
-      <w:r>
-        <w:rPr>
-          <w:color w:val="1A1A1A"/>
-        </w:rPr>
-        <w:t xml:space="preserve">ESCULHAMBADO — Bagunçado, desarrumado.</w:t>
-      </w:r>
-    </w:p>
-    <w:p>
-      <w:pPr>
-        <w:pStyle w:val="ListParagraph"/>
-        <w:numPr>
-          <w:ilvl w:val="0"/>
-          <w:numId w:val="2"/>
-        </w:numPr>
-        <w:spacing w:after="60"/>
-      </w:pPr>
-      <w:r>
-        <w:rPr>
-          <w:color w:val="1A1A1A"/>
-        </w:rPr>
-        <w:t xml:space="preserve">FACEIRO — Feliz, satisfeito, bem vestido/enfeitado, orgulhoso.</w:t>
+        <w:t xml:space="preserve">GAUDÉRIO — Termo tradicionalista para o gaúcho, o andarilho do campo — origem histórica da figura do gaúcho.</w:t>
       </w:r>
     </w:p>
     <w:p>
@@ -475,7 +382,7 @@
                 <w:bCs/>
                 <w:color w:val="1A1A1A"/>
               </w:rPr>
-              <w:t xml:space="preserve">VÍDEO 1: Só Quem É Gaúcho Entende</w:t>
+              <w:t xml:space="preserve">VÍDEO 1: Bah, Que Cheiro É Esse?</w:t>
             </w:r>
           </w:p>
         </w:tc>
@@ -604,22 +511,22 @@
                 <w:bCs/>
                 <w:color w:val="1A1A1A"/>
               </w:rPr>
+              <w:t xml:space="preserve">Farofa Santa Massa</w:t>
+            </w:r>
+          </w:p>
+          <w:p>
+            <w:pPr>
+              <w:spacing w:after="0"/>
+            </w:pPr>
+            <w:r>
+              <w:rPr>
+                <w:b/>
+                <w:bCs/>
+                <w:color w:val="1A1A1A"/>
+              </w:rPr>
               <w:t xml:space="preserve">Pão de Alho Recheado Santa Massa</w:t>
             </w:r>
           </w:p>
-          <w:p>
-            <w:pPr>
-              <w:spacing w:after="0"/>
-            </w:pPr>
-            <w:r>
-              <w:rPr>
-                <w:b/>
-                <w:bCs/>
-                <w:color w:val="1A1A1A"/>
-              </w:rPr>
-              <w:t xml:space="preserve">Farofa Santa Massa</w:t>
-            </w:r>
-          </w:p>
         </w:tc>
         <w:tc>
           <w:tcPr>
@@ -634,37 +541,53 @@
           </w:tcPr>
           <w:p>
             <w:pPr>
-              <w:spacing w:after="80"/>
-            </w:pPr>
-            <w:r>
-              <w:rPr>
-                <w:color w:val="1A1A1A"/>
-              </w:rPr>
-              <w:t xml:space="preserve">Formato "flashcard" de curiosidade, câmera selfie/frontal, uma pessoa falando direto pra câmera. A palavra gaúcha aparece em destaque na tela (ex: "GUAMPA"), a pessoa faz uma pausa de suspense e revela o significado em português comum ("CHIFRE — e é o copo que a gente usa pra tomar chimarrão!"). Corte seco para uma cena rápida de 2-3s do produto Santa Massa entrando em quadro (saindo da grelha ou sendo servido à mesa).</w:t>
-            </w:r>
-          </w:p>
-          <w:p>
-            <w:pPr>
-              <w:spacing w:after="80"/>
-            </w:pPr>
-            <w:r>
-              <w:rPr>
-                <w:color w:val="1A1A1A"/>
-              </w:rPr>
-              <w:t xml:space="preserve">Repetir o ciclo pergunta/resposta/produto três vezes, com palavras diferentes (GUAMPA, CUSCO, FACEIRO), sempre no mesmo ritmo de corte seco.</w:t>
-            </w:r>
-          </w:p>
-          <w:p>
-            <w:pPr>
-              <w:spacing w:after="80"/>
-            </w:pPr>
-            <w:r>
-              <w:rPr>
-                <w:b/>
-                <w:bCs/>
-                <w:color w:val="1A1A1A"/>
-              </w:rPr>
-              <w:t xml:space="preserve">Lettering:</w:t>
+              <w:spacing w:after="80" w:before="0"/>
+            </w:pPr>
+            <w:r>
+              <w:rPr>
+                <w:b/>
+                <w:bCs/>
+                <w:color w:val="1A1A1A"/>
+              </w:rPr>
+              <w:t xml:space="preserve">Ocasião de consumo: </w:t>
+            </w:r>
+            <w:r>
+              <w:rPr>
+                <w:color w:val="1A1A1A"/>
+              </w:rPr>
+              <w:t xml:space="preserve">Almoço de domingo em família — o momento em que a casa inteira já sabe que a comida tá quase pronta só pelo cheiro.</w:t>
+            </w:r>
+          </w:p>
+          <w:p>
+            <w:pPr>
+              <w:spacing w:after="80" w:before="0"/>
+            </w:pPr>
+            <w:r>
+              <w:rPr>
+                <w:b/>
+                <w:bCs/>
+                <w:color w:val="1A1A1A"/>
+              </w:rPr>
+              <w:t xml:space="preserve">Apetite appeal: </w:t>
+            </w:r>
+            <w:r>
+              <w:rPr>
+                <w:color w:val="1A1A1A"/>
+              </w:rPr>
+              <w:t xml:space="preserve">Vapor subindo da farofa quente na panela; corte do pão de alho puxando queijo derretido em câmera mais lenta; brilho de manteiga/azeite refletindo luz.</w:t>
+            </w:r>
+          </w:p>
+          <w:p>
+            <w:pPr>
+              <w:spacing w:after="80"/>
+            </w:pPr>
+            <w:r>
+              <w:rPr>
+                <w:b/>
+                <w:bCs/>
+                <w:color w:val="1A1A1A"/>
+              </w:rPr>
+              <w:t xml:space="preserve">Cena a cena:</w:t>
             </w:r>
           </w:p>
           <w:p>
@@ -680,7 +603,7 @@
               <w:rPr>
                 <w:color w:val="1A1A1A"/>
               </w:rPr>
-              <w:t xml:space="preserve">Ciclo 1: "GUAMPA = ?" → "CHIFRE (E O COPO DO CHIMARRÃO)"</w:t>
+              <w:t xml:space="preserve">Plano aberto de uma casa/quintal num domingo comum. Alguém para no meio do corredor, cheirando o ar, com uma expressão de "peraí, que cheiro é esse?".</w:t>
             </w:r>
           </w:p>
           <w:p>
@@ -696,7 +619,7 @@
               <w:rPr>
                 <w:color w:val="1A1A1A"/>
               </w:rPr>
-              <w:t xml:space="preserve">Ciclo 2: "CUSCO = ?" → "CACHORRO"</w:t>
+              <w:t xml:space="preserve">Corte para a cozinha/churrasqueira: farofa Santa Massa sendo finalizada na panela, vapor bem visível.</w:t>
             </w:r>
           </w:p>
           <w:p>
@@ -712,7 +635,68 @@
               <w:rPr>
                 <w:color w:val="1A1A1A"/>
               </w:rPr>
-              <w:t xml:space="preserve">Ciclo 3: "FACEIRO = ?" → "FELIZ, BEM VESTIDO, ORGULHOSO"</w:t>
+              <w:t xml:space="preserve">Close no pão de alho sendo partido ao meio, puxando queijo — câmera levemente em slow motion para valorizar a textura.</w:t>
+            </w:r>
+          </w:p>
+          <w:p>
+            <w:pPr>
+              <w:pStyle w:val="ListParagraph"/>
+              <w:numPr>
+                <w:ilvl w:val="0"/>
+                <w:numId w:val="2"/>
+              </w:numPr>
+              <w:spacing w:after="60"/>
+            </w:pPr>
+            <w:r>
+              <w:rPr>
+                <w:color w:val="1A1A1A"/>
+              </w:rPr>
+              <w:t xml:space="preserve">Mesa sendo montada, família se aproximando puxada pelo cheiro.</w:t>
+            </w:r>
+          </w:p>
+          <w:p>
+            <w:pPr>
+              <w:spacing w:after="80"/>
+            </w:pPr>
+            <w:r>
+              <w:rPr>
+                <w:b/>
+                <w:bCs/>
+                <w:color w:val="1A1A1A"/>
+              </w:rPr>
+              <w:t xml:space="preserve">Lettering:</w:t>
+            </w:r>
+          </w:p>
+          <w:p>
+            <w:pPr>
+              <w:pStyle w:val="ListParagraph"/>
+              <w:numPr>
+                <w:ilvl w:val="0"/>
+                <w:numId w:val="2"/>
+              </w:numPr>
+              <w:spacing w:after="60"/>
+            </w:pPr>
+            <w:r>
+              <w:rPr>
+                <w:color w:val="1A1A1A"/>
+              </w:rPr>
+              <w:t xml:space="preserve">"BAH, QUE CHEIRO É ESSE?"</w:t>
+            </w:r>
+          </w:p>
+          <w:p>
+            <w:pPr>
+              <w:pStyle w:val="ListParagraph"/>
+              <w:numPr>
+                <w:ilvl w:val="0"/>
+                <w:numId w:val="2"/>
+              </w:numPr>
+              <w:spacing w:after="60"/>
+            </w:pPr>
+            <w:r>
+              <w:rPr>
+                <w:color w:val="1A1A1A"/>
+              </w:rPr>
+              <w:t xml:space="preserve">"É DOMINGO. É SANTA MASSA."</w:t>
             </w:r>
           </w:p>
           <w:p>
@@ -727,7 +711,7 @@
               <w:t xml:space="preserve">Texto no vídeo: </w:t>
             </w:r>
             <w:r>
-              <w:t xml:space="preserve">sequência "PALAVRA = ?" seguida da resposta em cada ciclo (ver lettering)</w:t>
+              <w:t xml:space="preserve">BAH, QUE CHEIRO É ESSE? — É DOMINGO. É SANTA MASSA.</w:t>
             </w:r>
           </w:p>
         </w:tc>
@@ -752,7 +736,7 @@
                 <w:iCs/>
                 <w:color w:val="555555"/>
               </w:rPr>
-              <w:t xml:space="preserve">Buscar referência no Instagram/TikTok: vídeos formato pergunta-e-resposta de gírias regionais (estilo "você sabia que isso quer dizer isso"), câmera selfie com corte seco.</w:t>
+              <w:t xml:space="preserve">Buscar referência: Reels de "cheiro de comida chamando a família" — POV nariz seguindo o cheiro até a cozinha.</w:t>
             </w:r>
           </w:p>
         </w:tc>
@@ -777,7 +761,7 @@
                 <w:iCs/>
                 <w:color w:val="555555"/>
               </w:rPr>
-              <w:t xml:space="preserve">Texto grande centralizado tipo meme sobre fundo neutro, edição dinâmica, alternância rápida entre rosto e produto.</w:t>
+              <w:t xml:space="preserve">Transição do olfato (expressão facial) para a origem do cheiro (panela/grelha), fechando na mesa montada.</w:t>
             </w:r>
           </w:p>
         </w:tc>
@@ -830,7 +814,7 @@
                 <w:bCs/>
                 <w:color w:val="1A1A1A"/>
               </w:rPr>
-              <w:t xml:space="preserve">VÍDEO 2: O Cusco Também Quer</w:t>
+              <w:t xml:space="preserve">VÍDEO 2: Parabéns, Gaudério!</w:t>
             </w:r>
           </w:p>
         </w:tc>
@@ -951,6 +935,19 @@
           </w:tcPr>
           <w:p>
             <w:pPr>
+              <w:spacing w:after="60"/>
+            </w:pPr>
+            <w:r>
+              <w:rPr>
+                <w:b/>
+                <w:bCs/>
+                <w:color w:val="1A1A1A"/>
+              </w:rPr>
+              <w:t xml:space="preserve">Pão de Alho Recheado Santa Massa</w:t>
+            </w:r>
+          </w:p>
+          <w:p>
+            <w:pPr>
               <w:spacing w:after="0"/>
             </w:pPr>
             <w:r>
@@ -959,7 +956,7 @@
                 <w:bCs/>
                 <w:color w:val="1A1A1A"/>
               </w:rPr>
-              <w:t xml:space="preserve">Pão de Alho Recheado Santa Massa</w:t>
+              <w:t xml:space="preserve">Farofa Santa Massa</w:t>
             </w:r>
           </w:p>
         </w:tc>
@@ -976,37 +973,74 @@
           </w:tcPr>
           <w:p>
             <w:pPr>
-              <w:spacing w:after="80"/>
-            </w:pPr>
-            <w:r>
-              <w:rPr>
-                <w:color w:val="1A1A1A"/>
-              </w:rPr>
-              <w:t xml:space="preserve">Ambiente de churrasco caseiro (quintal ou varanda). Foco no pão de alho Santa Massa grelhando. Em um dos planos, entra em quadro um cachorro (cusco) olhando fixamente para a churrasqueira — reação de expectativa.</w:t>
-            </w:r>
-          </w:p>
-          <w:p>
-            <w:pPr>
-              <w:spacing w:after="80"/>
-            </w:pPr>
-            <w:r>
-              <w:rPr>
-                <w:color w:val="1A1A1A"/>
-              </w:rPr>
-              <w:t xml:space="preserve">Fecha com a pessoa dividindo um pedacinho sem tempero para o cachorro, todo mundo rindo. Câmera em plano baixo, na altura do animal, para reforçar o ponto de vista dele.</w:t>
-            </w:r>
-          </w:p>
-          <w:p>
-            <w:pPr>
-              <w:spacing w:after="80"/>
-            </w:pPr>
-            <w:r>
-              <w:rPr>
-                <w:b/>
-                <w:bCs/>
-                <w:color w:val="1A1A1A"/>
-              </w:rPr>
-              <w:t xml:space="preserve">Lettering:</w:t>
+              <w:spacing w:after="80" w:before="0"/>
+            </w:pPr>
+            <w:r>
+              <w:rPr>
+                <w:b/>
+                <w:bCs/>
+                <w:color w:val="1A1A1A"/>
+              </w:rPr>
+              <w:t xml:space="preserve">Contexto cultural: </w:t>
+            </w:r>
+            <w:r>
+              <w:rPr>
+                <w:i/>
+                <w:iCs/>
+                <w:color w:val="1A1A1A"/>
+              </w:rPr>
+              <w:t xml:space="preserve">"Gaudério" é o termo tradicionalista mais antigo para o gaúcho — o andarilho do campo que deu origem à figura do gaúcho como conhecemos. É comum, em CTGs e famílias tradicionalistas, chamar quem faz aniversário carinhosamente de "gaudério(a)" na hora de cantar o parabéns regional, composto em ritmo de xote por Dimas Costa e Eleu Salvador em 1958, que substitui o parabéns tradicional nas festas do estado.</w:t>
+            </w:r>
+          </w:p>
+          <w:p>
+            <w:pPr>
+              <w:spacing w:after="80" w:before="0"/>
+            </w:pPr>
+            <w:r>
+              <w:rPr>
+                <w:b/>
+                <w:bCs/>
+                <w:color w:val="1A1A1A"/>
+              </w:rPr>
+              <w:t xml:space="preserve">Ocasião de consumo: </w:t>
+            </w:r>
+            <w:r>
+              <w:rPr>
+                <w:color w:val="1A1A1A"/>
+              </w:rPr>
+              <w:t xml:space="preserve">Aniversário em casa ou em família de tradição gaúcha — o momento do parabéns antes de cortar o bolo, com a mesa de comida já servida ao lado.</w:t>
+            </w:r>
+          </w:p>
+          <w:p>
+            <w:pPr>
+              <w:spacing w:after="80" w:before="0"/>
+            </w:pPr>
+            <w:r>
+              <w:rPr>
+                <w:b/>
+                <w:bCs/>
+                <w:color w:val="1A1A1A"/>
+              </w:rPr>
+              <w:t xml:space="preserve">Apetite appeal: </w:t>
+            </w:r>
+            <w:r>
+              <w:rPr>
+                <w:color w:val="1A1A1A"/>
+              </w:rPr>
+              <w:t xml:space="preserve">Mesa de aniversário farta, com o prato de pão de alho e a travessa de farofa brilhando ao lado do bolo; fumaça leve ainda saindo do pão recém-tirado da grelha.</w:t>
+            </w:r>
+          </w:p>
+          <w:p>
+            <w:pPr>
+              <w:spacing w:after="80"/>
+            </w:pPr>
+            <w:r>
+              <w:rPr>
+                <w:b/>
+                <w:bCs/>
+                <w:color w:val="1A1A1A"/>
+              </w:rPr>
+              <w:t xml:space="preserve">Cena a cena:</w:t>
             </w:r>
           </w:p>
           <w:p>
@@ -1022,7 +1056,105 @@
               <w:rPr>
                 <w:color w:val="1A1A1A"/>
               </w:rPr>
-              <w:t xml:space="preserve">"ATÉ O CUSCO SABE QUE HOJE TEM PÃO DE ALHO"</w:t>
+              <w:t xml:space="preserve">Mesa de aniversário em casa, com bolo, mas também com uma travessa de pão de alho e farofa Santa Massa em destaque ao lado — deixando claro que ali também tem festa de comida boa.</w:t>
+            </w:r>
+          </w:p>
+          <w:p>
+            <w:pPr>
+              <w:pStyle w:val="ListParagraph"/>
+              <w:numPr>
+                <w:ilvl w:val="0"/>
+                <w:numId w:val="2"/>
+              </w:numPr>
+              <w:spacing w:after="60"/>
+            </w:pPr>
+            <w:r>
+              <w:rPr>
+                <w:color w:val="1A1A1A"/>
+              </w:rPr>
+              <w:t xml:space="preserve">Alguém começa a bater palmas fora de quadro (só mãos/ombro), puxando o ritmo de xote da canção.</w:t>
+            </w:r>
+          </w:p>
+          <w:p>
+            <w:pPr>
+              <w:pStyle w:val="ListParagraph"/>
+              <w:numPr>
+                <w:ilvl w:val="0"/>
+                <w:numId w:val="2"/>
+              </w:numPr>
+              <w:spacing w:after="60"/>
+            </w:pPr>
+            <w:r>
+              <w:rPr>
+                <w:color w:val="1A1A1A"/>
+              </w:rPr>
+              <w:t xml:space="preserve">Corte para o prato sendo servido enquanto a trilha "Parabéns Gaudério" toca por cima (sample de 10-15s da música ou versão instrumental licenciada).</w:t>
+            </w:r>
+          </w:p>
+          <w:p>
+            <w:pPr>
+              <w:pStyle w:val="ListParagraph"/>
+              <w:numPr>
+                <w:ilvl w:val="0"/>
+                <w:numId w:val="2"/>
+              </w:numPr>
+              <w:spacing w:after="60"/>
+            </w:pPr>
+            <w:r>
+              <w:rPr>
+                <w:color w:val="1A1A1A"/>
+              </w:rPr>
+              <w:t xml:space="preserve">Still final: prato + embalagens Santa Massa ao lado do bolo, com a letra em overlay estilo karaokê.</w:t>
+            </w:r>
+          </w:p>
+          <w:p>
+            <w:pPr>
+              <w:spacing w:after="80"/>
+            </w:pPr>
+            <w:r>
+              <w:rPr>
+                <w:b/>
+                <w:bCs/>
+                <w:color w:val="1A1A1A"/>
+              </w:rPr>
+              <w:t xml:space="preserve">Lettering:</w:t>
+            </w:r>
+          </w:p>
+          <w:p>
+            <w:pPr>
+              <w:pStyle w:val="ListParagraph"/>
+              <w:numPr>
+                <w:ilvl w:val="0"/>
+                <w:numId w:val="2"/>
+              </w:numPr>
+              <w:spacing w:after="60"/>
+            </w:pPr>
+            <w:r>
+              <w:rPr>
+                <w:color w:val="1A1A1A"/>
+              </w:rPr>
+              <w:t xml:space="preserve">"Parabéns, parabéns / Saúde e felicidade / Que tu colhas sempre todo dia / Paz e alegria na lavoura da amizade"</w:t>
+            </w:r>
+          </w:p>
+          <w:p>
+            <w:pPr>
+              <w:spacing w:after="80" w:before="60"/>
+            </w:pPr>
+            <w:r>
+              <w:rPr>
+                <w:b/>
+                <w:bCs/>
+                <w:i/>
+                <w:iCs/>
+              </w:rPr>
+              <w:t xml:space="preserve">Observação: </w:t>
+            </w:r>
+            <w:r>
+              <w:rPr>
+                <w:i/>
+                <w:iCs/>
+              </w:rPr>
+              <w:t xml:space="preserve">"Parabéns Gaúcho/Gaudério" é obra de Dimas Costa e Eleu Salvador — confirmar com o jurídico/gestora de direitos autorais (ECAD) o licenciamento do trecho musical antes de publicar, mesmo usando só a letra como overlay de texto.</w:t>
             </w:r>
           </w:p>
           <w:p>
@@ -1037,7 +1169,7 @@
               <w:t xml:space="preserve">Texto no vídeo: </w:t>
             </w:r>
             <w:r>
-              <w:t xml:space="preserve">ATÉ O CUSCO SABE QUE HOJE TEM PÃO DE ALHO</w:t>
+              <w:t xml:space="preserve">Letra em overlay estilo karaokê (ver lettering) + "FELIZ ANIVERSÁRIO, GAUDÉRIO(A)!"</w:t>
             </w:r>
           </w:p>
         </w:tc>
@@ -1062,7 +1194,7 @@
                 <w:iCs/>
                 <w:color w:val="555555"/>
               </w:rPr>
-              <w:t xml:space="preserve">Buscar referência: vídeos de "cachorro esperando churrasco" — formato recorrente e engraçado em contas de churrasco doméstico.</w:t>
+              <w:t xml:space="preserve">Buscar referência: Reels de aniversário em família com trilha regional, foco na mesa de comida antes do corte do bolo.</w:t>
             </w:r>
           </w:p>
         </w:tc>
@@ -1087,7 +1219,7 @@
                 <w:iCs/>
                 <w:color w:val="555555"/>
               </w:rPr>
-              <w:t xml:space="preserve">Contraste entre o antes (cachorro esperando, expressão de súplica) e o depois (ganhando o pedacinho, rabo abanando).</w:t>
+              <w:t xml:space="preserve">Mesa de aniversário com comida em primeiro plano e bolo ao fundo — inverte o foco usual (bolo em destaque) para valorizar o salgado.</w:t>
             </w:r>
           </w:p>
         </w:tc>
@@ -1140,7 +1272,7 @@
                 <w:bCs/>
                 <w:color w:val="1A1A1A"/>
               </w:rPr>
-              <w:t xml:space="preserve">VÍDEO 3: Não Precisa de Guampa Pra Isso</w:t>
+              <w:t xml:space="preserve">VÍDEO 3: Intervalo de Clássico</w:t>
             </w:r>
           </w:p>
         </w:tc>
@@ -1286,37 +1418,53 @@
           </w:tcPr>
           <w:p>
             <w:pPr>
-              <w:spacing w:after="80"/>
-            </w:pPr>
-            <w:r>
-              <w:rPr>
-                <w:color w:val="1A1A1A"/>
-              </w:rPr>
-              <w:t xml:space="preserve">Still-life inicial: uma guampa (chifre/copo de chimarrão) sobre a mesa, ao lado da cuia e da erva-mate, boa iluminação.</w:t>
-            </w:r>
-          </w:p>
-          <w:p>
-            <w:pPr>
-              <w:spacing w:after="80"/>
-            </w:pPr>
-            <w:r>
-              <w:rPr>
-                <w:color w:val="1A1A1A"/>
-              </w:rPr>
-              <w:t xml:space="preserve">Corte para o pão de alho Santa Massa saindo da grelha, puxando queijo derretido ao ser partido — câmera aproximando para valorizar o vapor e a textura.</w:t>
-            </w:r>
-          </w:p>
-          <w:p>
-            <w:pPr>
-              <w:spacing w:after="80"/>
-            </w:pPr>
-            <w:r>
-              <w:rPr>
-                <w:b/>
-                <w:bCs/>
-                <w:color w:val="1A1A1A"/>
-              </w:rPr>
-              <w:t xml:space="preserve">Lettering:</w:t>
+              <w:spacing w:after="80" w:before="0"/>
+            </w:pPr>
+            <w:r>
+              <w:rPr>
+                <w:b/>
+                <w:bCs/>
+                <w:color w:val="1A1A1A"/>
+              </w:rPr>
+              <w:t xml:space="preserve">Ocasião de consumo: </w:t>
+            </w:r>
+            <w:r>
+              <w:rPr>
+                <w:color w:val="1A1A1A"/>
+              </w:rPr>
+              <w:t xml:space="preserve">Tarde de clássico gaúcho na TV — amigos reunidos em casa pra assistir o jogo, comendo algo prático no intervalo.</w:t>
+            </w:r>
+          </w:p>
+          <w:p>
+            <w:pPr>
+              <w:spacing w:after="80" w:before="0"/>
+            </w:pPr>
+            <w:r>
+              <w:rPr>
+                <w:b/>
+                <w:bCs/>
+                <w:color w:val="1A1A1A"/>
+              </w:rPr>
+              <w:t xml:space="preserve">Apetite appeal: </w:t>
+            </w:r>
+            <w:r>
+              <w:rPr>
+                <w:color w:val="1A1A1A"/>
+              </w:rPr>
+              <w:t xml:space="preserve">Pão de alho inteiro sendo fatiado na tábua, queijo esticando entre as fatias; fumaça leve ainda saindo do produto recém-grelhado.</w:t>
+            </w:r>
+          </w:p>
+          <w:p>
+            <w:pPr>
+              <w:spacing w:after="80"/>
+            </w:pPr>
+            <w:r>
+              <w:rPr>
+                <w:b/>
+                <w:bCs/>
+                <w:color w:val="1A1A1A"/>
+              </w:rPr>
+              <w:t xml:space="preserve">Cena a cena:</w:t>
             </w:r>
           </w:p>
           <w:p>
@@ -1332,7 +1480,7 @@
               <w:rPr>
                 <w:color w:val="1A1A1A"/>
               </w:rPr>
-              <w:t xml:space="preserve">"PRA CHIMARRÃO, PRECISA DE GUAMPA."</w:t>
+              <w:t xml:space="preserve">Sala de estar/varanda com a TV ligada (áudio de torcida ao fundo, sem mostrar escudos de time para não parecer patrocínio).</w:t>
             </w:r>
           </w:p>
           <w:p>
@@ -1348,7 +1496,68 @@
               <w:rPr>
                 <w:color w:val="1A1A1A"/>
               </w:rPr>
-              <w:t xml:space="preserve">"PRA PÃO DE ALHO SANTA MASSA, SÓ PRECISA DE FOME."</w:t>
+              <w:t xml:space="preserve">Aos gritos de gol/comemoração, corte para a cozinha: pão de alho Santa Massa saindo da grelha.</w:t>
+            </w:r>
+          </w:p>
+          <w:p>
+            <w:pPr>
+              <w:pStyle w:val="ListParagraph"/>
+              <w:numPr>
+                <w:ilvl w:val="0"/>
+                <w:numId w:val="2"/>
+              </w:numPr>
+              <w:spacing w:after="60"/>
+            </w:pPr>
+            <w:r>
+              <w:rPr>
+                <w:color w:val="1A1A1A"/>
+              </w:rPr>
+              <w:t xml:space="preserve">Fatiado na tábua, puxando queijo — close de textura.</w:t>
+            </w:r>
+          </w:p>
+          <w:p>
+            <w:pPr>
+              <w:pStyle w:val="ListParagraph"/>
+              <w:numPr>
+                <w:ilvl w:val="0"/>
+                <w:numId w:val="2"/>
+              </w:numPr>
+              <w:spacing w:after="60"/>
+            </w:pPr>
+            <w:r>
+              <w:rPr>
+                <w:color w:val="1A1A1A"/>
+              </w:rPr>
+              <w:t xml:space="preserve">Volta pra sala: bandeja circulando entre os amigos no intervalo do jogo.</w:t>
+            </w:r>
+          </w:p>
+          <w:p>
+            <w:pPr>
+              <w:spacing w:after="80"/>
+            </w:pPr>
+            <w:r>
+              <w:rPr>
+                <w:b/>
+                <w:bCs/>
+                <w:color w:val="1A1A1A"/>
+              </w:rPr>
+              <w:t xml:space="preserve">Lettering:</w:t>
+            </w:r>
+          </w:p>
+          <w:p>
+            <w:pPr>
+              <w:pStyle w:val="ListParagraph"/>
+              <w:numPr>
+                <w:ilvl w:val="0"/>
+                <w:numId w:val="2"/>
+              </w:numPr>
+              <w:spacing w:after="60"/>
+            </w:pPr>
+            <w:r>
+              <w:rPr>
+                <w:color w:val="1A1A1A"/>
+              </w:rPr>
+              <w:t xml:space="preserve">"O JOGO PARA. O PÃO DE ALHO, NÃO."</w:t>
             </w:r>
           </w:p>
           <w:p>
@@ -1363,7 +1572,7 @@
               <w:t xml:space="preserve">Texto no vídeo: </w:t>
             </w:r>
             <w:r>
-              <w:t xml:space="preserve">PRA CHIMARRÃO, PRECISA DE GUAMPA. PRA ISSO AQUI, SÓ PRECISA DE FOME.</w:t>
+              <w:t xml:space="preserve">O JOGO PARA NO INTERVALO. O PÃO DE ALHO, NÃO.</w:t>
             </w:r>
           </w:p>
         </w:tc>
@@ -1388,7 +1597,7 @@
                 <w:iCs/>
                 <w:color w:val="555555"/>
               </w:rPr>
-              <w:t xml:space="preserve">Buscar referência: formato comparação "isso precisa disso / isso não precisa de nada" — comum em Reels de comida.</w:t>
+              <w:t xml:space="preserve">Buscar referência: Reels de "comida de intervalo de jogo" em rodas de amigos — comum em contas de churrasco e petiscos.</w:t>
             </w:r>
           </w:p>
         </w:tc>
@@ -1413,7 +1622,7 @@
                 <w:iCs/>
                 <w:color w:val="555555"/>
               </w:rPr>
-              <w:t xml:space="preserve">Still-life de objeto tradicional com luz quente, seguido de close no alimento quente/com vapor visível.</w:t>
+              <w:t xml:space="preserve">Corte rítmico entre a torcida na tela e o produto sendo preparado, sincronizado como se fosse parte da jogada.</w:t>
             </w:r>
           </w:p>
         </w:tc>
@@ -1466,7 +1675,7 @@
                 <w:bCs/>
                 <w:color w:val="1A1A1A"/>
               </w:rPr>
-              <w:t xml:space="preserve">VÍDEO 4: Aquela Sesteada Depois do Churrasco</w:t>
+              <w:t xml:space="preserve">VÍDEO 4: Depois do Jogo de Bocha</w:t>
             </w:r>
           </w:p>
         </w:tc>
@@ -1587,7 +1796,7 @@
           </w:tcPr>
           <w:p>
             <w:pPr>
-              <w:spacing w:after="60"/>
+              <w:spacing w:after="0"/>
             </w:pPr>
             <w:r>
               <w:rPr>
@@ -1598,19 +1807,6 @@
               <w:t xml:space="preserve">Farofa Santa Massa</w:t>
             </w:r>
           </w:p>
-          <w:p>
-            <w:pPr>
-              <w:spacing w:after="0"/>
-            </w:pPr>
-            <w:r>
-              <w:rPr>
-                <w:b/>
-                <w:bCs/>
-                <w:color w:val="1A1A1A"/>
-              </w:rPr>
-              <w:t xml:space="preserve">Pão de Alho Recheado Santa Massa</w:t>
-            </w:r>
-          </w:p>
         </w:tc>
         <w:tc>
           <w:tcPr>
@@ -1625,37 +1821,53 @@
           </w:tcPr>
           <w:p>
             <w:pPr>
-              <w:spacing w:after="80"/>
-            </w:pPr>
-            <w:r>
-              <w:rPr>
-                <w:color w:val="1A1A1A"/>
-              </w:rPr>
-              <w:t xml:space="preserve">Sequência mostrando o auge do churrasco: prato montado com carne, farofa e pão de alho Santa Massa, pessoa comendo com satisfação visível.</w:t>
-            </w:r>
-          </w:p>
-          <w:p>
-            <w:pPr>
-              <w:spacing w:after="80"/>
-            </w:pPr>
-            <w:r>
-              <w:rPr>
-                <w:color w:val="1A1A1A"/>
-              </w:rPr>
-              <w:t xml:space="preserve">A cena fecha com a mesma pessoa se acomodando no sofá/rede logo depois, num tom preguiçoso e bem-humorado — a clássica "sesteada" pós-churrasco.</w:t>
-            </w:r>
-          </w:p>
-          <w:p>
-            <w:pPr>
-              <w:spacing w:after="80"/>
-            </w:pPr>
-            <w:r>
-              <w:rPr>
-                <w:b/>
-                <w:bCs/>
-                <w:color w:val="1A1A1A"/>
-              </w:rPr>
-              <w:t xml:space="preserve">Lettering:</w:t>
+              <w:spacing w:after="80" w:before="0"/>
+            </w:pPr>
+            <w:r>
+              <w:rPr>
+                <w:b/>
+                <w:bCs/>
+                <w:color w:val="1A1A1A"/>
+              </w:rPr>
+              <w:t xml:space="preserve">Ocasião de consumo: </w:t>
+            </w:r>
+            <w:r>
+              <w:rPr>
+                <w:color w:val="1A1A1A"/>
+              </w:rPr>
+              <w:t xml:space="preserve">Fim de tarde de bocha ou taba no quintal/CTG com amigos — todo mundo chega faminto depois da partida.</w:t>
+            </w:r>
+          </w:p>
+          <w:p>
+            <w:pPr>
+              <w:spacing w:after="80" w:before="0"/>
+            </w:pPr>
+            <w:r>
+              <w:rPr>
+                <w:b/>
+                <w:bCs/>
+                <w:color w:val="1A1A1A"/>
+              </w:rPr>
+              <w:t xml:space="preserve">Apetite appeal: </w:t>
+            </w:r>
+            <w:r>
+              <w:rPr>
+                <w:color w:val="1A1A1A"/>
+              </w:rPr>
+              <w:t xml:space="preserve">Farofa Santa Massa sendo esquentada na frigideira, som de crocância em destaque, grãos soltos e dourados caindo no prato.</w:t>
+            </w:r>
+          </w:p>
+          <w:p>
+            <w:pPr>
+              <w:spacing w:after="80"/>
+            </w:pPr>
+            <w:r>
+              <w:rPr>
+                <w:b/>
+                <w:bCs/>
+                <w:color w:val="1A1A1A"/>
+              </w:rPr>
+              <w:t xml:space="preserve">Cena a cena:</w:t>
             </w:r>
           </w:p>
           <w:p>
@@ -1671,7 +1883,84 @@
               <w:rPr>
                 <w:color w:val="1A1A1A"/>
               </w:rPr>
-              <w:t xml:space="preserve">"DEPOIS DESSA MESA, SÓ TEM UM CAMINHO: A SESTEADA."</w:t>
+              <w:t xml:space="preserve">Plano geral de uma partida informal de bocha no quintal (bolas rolando na grama/terra batida), risadas, disputa.</w:t>
+            </w:r>
+          </w:p>
+          <w:p>
+            <w:pPr>
+              <w:pStyle w:val="ListParagraph"/>
+              <w:numPr>
+                <w:ilvl w:val="0"/>
+                <w:numId w:val="2"/>
+              </w:numPr>
+              <w:spacing w:after="60"/>
+            </w:pPr>
+            <w:r>
+              <w:rPr>
+                <w:color w:val="1A1A1A"/>
+              </w:rPr>
+              <w:t xml:space="preserve">Corte para a cozinha: farofa Santa Massa sendo esquentada, som da crocância em primeiro plano (áudio valorizado).</w:t>
+            </w:r>
+          </w:p>
+          <w:p>
+            <w:pPr>
+              <w:pStyle w:val="ListParagraph"/>
+              <w:numPr>
+                <w:ilvl w:val="0"/>
+                <w:numId w:val="2"/>
+              </w:numPr>
+              <w:spacing w:after="60"/>
+            </w:pPr>
+            <w:r>
+              <w:rPr>
+                <w:color w:val="1A1A1A"/>
+              </w:rPr>
+              <w:t xml:space="preserve">Farofa servida numa travessa levada até o grupo, ainda no quintal.</w:t>
+            </w:r>
+          </w:p>
+          <w:p>
+            <w:pPr>
+              <w:pStyle w:val="ListParagraph"/>
+              <w:numPr>
+                <w:ilvl w:val="0"/>
+                <w:numId w:val="2"/>
+              </w:numPr>
+              <w:spacing w:after="60"/>
+            </w:pPr>
+            <w:r>
+              <w:rPr>
+                <w:color w:val="1A1A1A"/>
+              </w:rPr>
+              <w:t xml:space="preserve">Reação de satisfação de quem experimenta — um dos amigos comenta, todo mundo ri, clima leve.</w:t>
+            </w:r>
+          </w:p>
+          <w:p>
+            <w:pPr>
+              <w:spacing w:after="80"/>
+            </w:pPr>
+            <w:r>
+              <w:rPr>
+                <w:b/>
+                <w:bCs/>
+                <w:color w:val="1A1A1A"/>
+              </w:rPr>
+              <w:t xml:space="preserve">Lettering:</w:t>
+            </w:r>
+          </w:p>
+          <w:p>
+            <w:pPr>
+              <w:pStyle w:val="ListParagraph"/>
+              <w:numPr>
+                <w:ilvl w:val="0"/>
+                <w:numId w:val="2"/>
+              </w:numPr>
+              <w:spacing w:after="60"/>
+            </w:pPr>
+            <w:r>
+              <w:rPr>
+                <w:color w:val="1A1A1A"/>
+              </w:rPr>
+              <w:t xml:space="preserve">"PERDEU A PARTIDA, MAS FICOU FACEIRO NO PRATO."</w:t>
             </w:r>
           </w:p>
           <w:p>
@@ -1686,7 +1975,7 @@
               <w:t xml:space="preserve">Texto no vídeo: </w:t>
             </w:r>
             <w:r>
-              <w:t xml:space="preserve">DEPOIS DESSA MESA, SÓ TEM UM CAMINHO: A SESTEADA.</w:t>
+              <w:t xml:space="preserve">PERDEU A PARTIDA, MAS FICOU FACEIRO NO PRATO.</w:t>
             </w:r>
           </w:p>
         </w:tc>
@@ -1711,7 +2000,7 @@
                 <w:iCs/>
                 <w:color w:val="555555"/>
               </w:rPr>
-              <w:t xml:space="preserve">Buscar referência: Reels de humor pós-refeição ("comida boa demais, hora de dormir").</w:t>
+              <w:t xml:space="preserve">Buscar referência: Reels de jogos de quintal entre amigos (bocha, taba, buraco) seguidos de comida — bom gancho de comunidade/lazer.</w:t>
             </w:r>
           </w:p>
         </w:tc>
@@ -1736,7 +2025,7 @@
                 <w:iCs/>
                 <w:color w:val="555555"/>
               </w:rPr>
-              <w:t xml:space="preserve">Transição rápida do prato para a pessoa se acomodando; luz mais baixa/aconchegante na cena final.</w:t>
+              <w:t xml:space="preserve">Áudio em destaque no momento da farofa crocante (ASMR leve), contraste entre o esforço físico do jogo e o descanso da comida.</w:t>
             </w:r>
           </w:p>
         </w:tc>
@@ -1789,7 +2078,7 @@
                 <w:bCs/>
                 <w:color w:val="1A1A1A"/>
               </w:rPr>
-              <w:t xml:space="preserve">VÍDEO 5: Chinelagem de Churrasco</w:t>
+              <w:t xml:space="preserve">VÍDEO 5: Vale Cada Pila</w:t>
             </w:r>
           </w:p>
         </w:tc>
@@ -1910,6 +2199,19 @@
           </w:tcPr>
           <w:p>
             <w:pPr>
+              <w:spacing w:after="60"/>
+            </w:pPr>
+            <w:r>
+              <w:rPr>
+                <w:b/>
+                <w:bCs/>
+                <w:color w:val="1A1A1A"/>
+              </w:rPr>
+              <w:t xml:space="preserve">Pão de Alho Recheado Santa Massa</w:t>
+            </w:r>
+          </w:p>
+          <w:p>
+            <w:pPr>
               <w:spacing w:after="0"/>
             </w:pPr>
             <w:r>
@@ -1918,7 +2220,7 @@
                 <w:bCs/>
                 <w:color w:val="1A1A1A"/>
               </w:rPr>
-              <w:t xml:space="preserve">Pão de Alho Recheado Santa Massa</w:t>
+              <w:t xml:space="preserve">Farofa Santa Massa</w:t>
             </w:r>
           </w:p>
         </w:tc>
@@ -1935,37 +2237,53 @@
           </w:tcPr>
           <w:p>
             <w:pPr>
-              <w:spacing w:after="80"/>
-            </w:pPr>
-            <w:r>
-              <w:rPr>
-                <w:color w:val="1A1A1A"/>
-              </w:rPr>
-              <w:t xml:space="preserve">A travessa de pão de alho Santa Massa aparece praticamente vazia, sobrando só um pedaço. Duas mãos entram em quadro disputando o último pedaço, de brincadeira.</w:t>
-            </w:r>
-          </w:p>
-          <w:p>
-            <w:pPr>
-              <w:spacing w:after="80"/>
-            </w:pPr>
-            <w:r>
-              <w:rPr>
-                <w:color w:val="1A1A1A"/>
-              </w:rPr>
-              <w:t xml:space="preserve">Fecha com uma das pessoas "vencendo" e comendo o pedaço, rindo — reforçando a palavra "chinelagem" (sacanagem/brincadeira de mau gosto) usada no lettering.</w:t>
-            </w:r>
-          </w:p>
-          <w:p>
-            <w:pPr>
-              <w:spacing w:after="80"/>
-            </w:pPr>
-            <w:r>
-              <w:rPr>
-                <w:b/>
-                <w:bCs/>
-                <w:color w:val="1A1A1A"/>
-              </w:rPr>
-              <w:t xml:space="preserve">Lettering:</w:t>
+              <w:spacing w:after="80" w:before="0"/>
+            </w:pPr>
+            <w:r>
+              <w:rPr>
+                <w:b/>
+                <w:bCs/>
+                <w:color w:val="1A1A1A"/>
+              </w:rPr>
+              <w:t xml:space="preserve">Ocasião de consumo: </w:t>
+            </w:r>
+            <w:r>
+              <w:rPr>
+                <w:color w:val="1A1A1A"/>
+              </w:rPr>
+              <w:t xml:space="preserve">Sexta à noite, happy hour em casa — mesa de petiscos simples entre amigos antes de sair ou pra ficar mesmo.</w:t>
+            </w:r>
+          </w:p>
+          <w:p>
+            <w:pPr>
+              <w:spacing w:after="80" w:before="0"/>
+            </w:pPr>
+            <w:r>
+              <w:rPr>
+                <w:b/>
+                <w:bCs/>
+                <w:color w:val="1A1A1A"/>
+              </w:rPr>
+              <w:t xml:space="preserve">Apetite appeal: </w:t>
+            </w:r>
+            <w:r>
+              <w:rPr>
+                <w:color w:val="1A1A1A"/>
+              </w:rPr>
+              <w:t xml:space="preserve">Mesa de petiscos completa, luz quente (tipo boteco), still com o pão de alho já pela metade e a farofa numa tigela pequena ao lado das bebidas.</w:t>
+            </w:r>
+          </w:p>
+          <w:p>
+            <w:pPr>
+              <w:spacing w:after="80"/>
+            </w:pPr>
+            <w:r>
+              <w:rPr>
+                <w:b/>
+                <w:bCs/>
+                <w:color w:val="1A1A1A"/>
+              </w:rPr>
+              <w:t xml:space="preserve">Cena a cena:</w:t>
             </w:r>
           </w:p>
           <w:p>
@@ -1981,7 +2299,68 @@
               <w:rPr>
                 <w:color w:val="1A1A1A"/>
               </w:rPr>
-              <w:t xml:space="preserve">"ISSO AQUI É CHINELAGEM: NINGUÉM AVISA QUE TAVA ACABANDO."</w:t>
+              <w:t xml:space="preserve">Mesa de sexta à noite sendo montada: petiscos variados, e o pão de alho e a farofa Santa Massa ganhando destaque entre eles.</w:t>
+            </w:r>
+          </w:p>
+          <w:p>
+            <w:pPr>
+              <w:pStyle w:val="ListParagraph"/>
+              <w:numPr>
+                <w:ilvl w:val="0"/>
+                <w:numId w:val="2"/>
+              </w:numPr>
+              <w:spacing w:after="60"/>
+            </w:pPr>
+            <w:r>
+              <w:rPr>
+                <w:color w:val="1A1A1A"/>
+              </w:rPr>
+              <w:t xml:space="preserve">Alguém serve um pedaço do pão de alho pro amigo, reação de aprovação imediata.</w:t>
+            </w:r>
+          </w:p>
+          <w:p>
+            <w:pPr>
+              <w:pStyle w:val="ListParagraph"/>
+              <w:numPr>
+                <w:ilvl w:val="0"/>
+                <w:numId w:val="2"/>
+              </w:numPr>
+              <w:spacing w:after="60"/>
+            </w:pPr>
+            <w:r>
+              <w:rPr>
+                <w:color w:val="1A1A1A"/>
+              </w:rPr>
+              <w:t xml:space="preserve">Still da embalagem ao lado do prato quase vazio, sugerindo que "sumiu rápido".</w:t>
+            </w:r>
+          </w:p>
+          <w:p>
+            <w:pPr>
+              <w:spacing w:after="80"/>
+            </w:pPr>
+            <w:r>
+              <w:rPr>
+                <w:b/>
+                <w:bCs/>
+                <w:color w:val="1A1A1A"/>
+              </w:rPr>
+              <w:t xml:space="preserve">Lettering:</w:t>
+            </w:r>
+          </w:p>
+          <w:p>
+            <w:pPr>
+              <w:pStyle w:val="ListParagraph"/>
+              <w:numPr>
+                <w:ilvl w:val="0"/>
+                <w:numId w:val="2"/>
+              </w:numPr>
+              <w:spacing w:after="60"/>
+            </w:pPr>
+            <w:r>
+              <w:rPr>
+                <w:color w:val="1A1A1A"/>
+              </w:rPr>
+              <w:t xml:space="preserve">"CUSTA UMA PILA E VALE UM RIO GRANDE."</w:t>
             </w:r>
           </w:p>
           <w:p>
@@ -1996,7 +2375,7 @@
               <w:t xml:space="preserve">Texto no vídeo: </w:t>
             </w:r>
             <w:r>
-              <w:t xml:space="preserve">ISSO AQUI É CHINELAGEM: NINGUÉM AVISA QUE TAVA ACABANDO.</w:t>
+              <w:t xml:space="preserve">CUSTA UMA PILA E VALE UM RIO GRANDE.</w:t>
             </w:r>
           </w:p>
         </w:tc>
@@ -2021,7 +2400,7 @@
                 <w:iCs/>
                 <w:color w:val="555555"/>
               </w:rPr>
-              <w:t xml:space="preserve">Buscar referência: Reels de disputa pelo último pedaço à mesa — formato recorrente em contas de comida em família.</w:t>
+              <w:t xml:space="preserve">Buscar referência: Reels de mesa de happy hour em casa entre amigos, plano aberto da mesa + closes individuais dos petiscos.</w:t>
             </w:r>
           </w:p>
         </w:tc>
@@ -2046,7 +2425,7 @@
                 <w:iCs/>
                 <w:color w:val="555555"/>
               </w:rPr>
-              <w:t xml:space="preserve">Câmera dinâmica, duas mãos disputando em quadro, corte rápido no desfecho.</w:t>
+              <w:t xml:space="preserve">Luz quente estilo boteco, prato central sendo esvaziado ao longo do vídeo para reforçar que "sumiu rápido".</w:t>
             </w:r>
           </w:p>
         </w:tc>
@@ -2099,7 +2478,7 @@
                 <w:bCs/>
                 <w:color w:val="1A1A1A"/>
               </w:rPr>
-              <w:t xml:space="preserve">VÍDEO 6: Só Fica Faceiro Quem Testou</w:t>
+              <w:t xml:space="preserve">VÍDEO 6: Aquele Frio de Julho</w:t>
             </w:r>
           </w:p>
         </w:tc>
@@ -2228,7 +2607,7 @@
                 <w:bCs/>
                 <w:color w:val="1A1A1A"/>
               </w:rPr>
-              <w:t xml:space="preserve">Farofa Santa Massa</w:t>
+              <w:t xml:space="preserve">Pão de Alho Recheado Santa Massa</w:t>
             </w:r>
           </w:p>
         </w:tc>
@@ -2245,37 +2624,53 @@
           </w:tcPr>
           <w:p>
             <w:pPr>
-              <w:spacing w:after="80"/>
-            </w:pPr>
-            <w:r>
-              <w:rPr>
-                <w:color w:val="1A1A1A"/>
-              </w:rPr>
-              <w:t xml:space="preserve">Pessoa provando a farofa Santa Massa recém-preparada, reação de satisfação genuína (sorriso, positividade evidente).</w:t>
-            </w:r>
-          </w:p>
-          <w:p>
-            <w:pPr>
-              <w:spacing w:after="80"/>
-            </w:pPr>
-            <w:r>
-              <w:rPr>
-                <w:color w:val="1A1A1A"/>
-              </w:rPr>
-              <w:t xml:space="preserve">Fecha com still da embalagem do produto, usando a palavra "faceiro" (gauchismo para alguém feliz, bem vestido, se sentindo bem) no lettering.</w:t>
-            </w:r>
-          </w:p>
-          <w:p>
-            <w:pPr>
-              <w:spacing w:after="80"/>
-            </w:pPr>
-            <w:r>
-              <w:rPr>
-                <w:b/>
-                <w:bCs/>
-                <w:color w:val="1A1A1A"/>
-              </w:rPr>
-              <w:t xml:space="preserve">Lettering:</w:t>
+              <w:spacing w:after="80" w:before="0"/>
+            </w:pPr>
+            <w:r>
+              <w:rPr>
+                <w:b/>
+                <w:bCs/>
+                <w:color w:val="1A1A1A"/>
+              </w:rPr>
+              <w:t xml:space="preserve">Ocasião de consumo: </w:t>
+            </w:r>
+            <w:r>
+              <w:rPr>
+                <w:color w:val="1A1A1A"/>
+              </w:rPr>
+              <w:t xml:space="preserve">Noite fria de inverno gaúcho — o momento de chegar em casa com frio e quere algo quente na hora.</w:t>
+            </w:r>
+          </w:p>
+          <w:p>
+            <w:pPr>
+              <w:spacing w:after="80" w:before="0"/>
+            </w:pPr>
+            <w:r>
+              <w:rPr>
+                <w:b/>
+                <w:bCs/>
+                <w:color w:val="1A1A1A"/>
+              </w:rPr>
+              <w:t xml:space="preserve">Apetite appeal: </w:t>
+            </w:r>
+            <w:r>
+              <w:rPr>
+                <w:color w:val="1A1A1A"/>
+              </w:rPr>
+              <w:t xml:space="preserve">Contraste entre o frio (respiração visível, mãos frias) e o vapor forte saindo do pão de alho recém-pronto; queijo esticando bem devagar.</w:t>
+            </w:r>
+          </w:p>
+          <w:p>
+            <w:pPr>
+              <w:spacing w:after="80"/>
+            </w:pPr>
+            <w:r>
+              <w:rPr>
+                <w:b/>
+                <w:bCs/>
+                <w:color w:val="1A1A1A"/>
+              </w:rPr>
+              <w:t xml:space="preserve">Cena a cena:</w:t>
             </w:r>
           </w:p>
           <w:p>
@@ -2291,28 +2686,68 @@
               <w:rPr>
                 <w:color w:val="1A1A1A"/>
               </w:rPr>
-              <w:t xml:space="preserve">"TEM QUE FICAR FACEIRO PRA COMER ASSIM."</w:t>
-            </w:r>
-          </w:p>
-          <w:p>
-            <w:pPr>
-              <w:spacing w:after="80" w:before="60"/>
-            </w:pPr>
-            <w:r>
-              <w:rPr>
-                <w:b/>
-                <w:bCs/>
-                <w:i/>
-                <w:iCs/>
-              </w:rPr>
-              <w:t xml:space="preserve">Observação: </w:t>
-            </w:r>
-            <w:r>
-              <w:rPr>
-                <w:i/>
-                <w:iCs/>
-              </w:rPr>
-              <w:t xml:space="preserve">Seguir a recomendação padrão da marca: farofa/pão sempre com aparência fresca e apetitosa no still final.</w:t>
+              <w:t xml:space="preserve">Alguém chegando em casa à noite, se esfregando pra esquentar as mãos, típico frio gaúcho de julho.</w:t>
+            </w:r>
+          </w:p>
+          <w:p>
+            <w:pPr>
+              <w:pStyle w:val="ListParagraph"/>
+              <w:numPr>
+                <w:ilvl w:val="0"/>
+                <w:numId w:val="2"/>
+              </w:numPr>
+              <w:spacing w:after="60"/>
+            </w:pPr>
+            <w:r>
+              <w:rPr>
+                <w:color w:val="1A1A1A"/>
+              </w:rPr>
+              <w:t xml:space="preserve">Corte para o pão de alho Santa Massa saindo do forno/grelha, vapor bem visível no ar frio.</w:t>
+            </w:r>
+          </w:p>
+          <w:p>
+            <w:pPr>
+              <w:pStyle w:val="ListParagraph"/>
+              <w:numPr>
+                <w:ilvl w:val="0"/>
+                <w:numId w:val="2"/>
+              </w:numPr>
+              <w:spacing w:after="60"/>
+            </w:pPr>
+            <w:r>
+              <w:rPr>
+                <w:color w:val="1A1A1A"/>
+              </w:rPr>
+              <w:t xml:space="preserve">Primeira mordida, expressão de alívio/conforto.</w:t>
+            </w:r>
+          </w:p>
+          <w:p>
+            <w:pPr>
+              <w:spacing w:after="80"/>
+            </w:pPr>
+            <w:r>
+              <w:rPr>
+                <w:b/>
+                <w:bCs/>
+                <w:color w:val="1A1A1A"/>
+              </w:rPr>
+              <w:t xml:space="preserve">Lettering:</w:t>
+            </w:r>
+          </w:p>
+          <w:p>
+            <w:pPr>
+              <w:pStyle w:val="ListParagraph"/>
+              <w:numPr>
+                <w:ilvl w:val="0"/>
+                <w:numId w:val="2"/>
+              </w:numPr>
+              <w:spacing w:after="60"/>
+            </w:pPr>
+            <w:r>
+              <w:rPr>
+                <w:color w:val="1A1A1A"/>
+              </w:rPr>
+              <w:t xml:space="preserve">"O FRIO NÃO PERDOA. O PÃO DE ALHO, TAMBÉM NÃO."</w:t>
             </w:r>
           </w:p>
           <w:p>
@@ -2327,7 +2762,7 @@
               <w:t xml:space="preserve">Texto no vídeo: </w:t>
             </w:r>
             <w:r>
-              <w:t xml:space="preserve">TEM QUE FICAR FACEIRO PRA COMER ASSIM.</w:t>
+              <w:t xml:space="preserve">O FRIO NÃO PERDOA. O PÃO DE ALHO, TAMBÉM NÃO.</w:t>
             </w:r>
           </w:p>
         </w:tc>
@@ -2352,7 +2787,7 @@
                 <w:iCs/>
                 <w:color w:val="555555"/>
               </w:rPr>
-              <w:t xml:space="preserve">Buscar referência: Reels de reação/prova de produto em primeira pessoa (formato POV comendo).</w:t>
+              <w:t xml:space="preserve">Buscar referência: Reels de "comida quente em dia frio" — contraste de temperatura como gancho visual.</w:t>
             </w:r>
           </w:p>
         </w:tc>
@@ -2377,7 +2812,7 @@
                 <w:iCs/>
                 <w:color w:val="555555"/>
               </w:rPr>
-              <w:t xml:space="preserve">Câmera próxima ao rosto, boa luz natural, still final do produto em destaque.</w:t>
+              <w:t xml:space="preserve">Vapor do produto contra o ambiente frio (respiração visível de propósito), luz mais azulada fora e quente dentro de casa.</w:t>
             </w:r>
           </w:p>
         </w:tc>
@@ -2430,7 +2865,7 @@
                 <w:bCs/>
                 <w:color w:val="1A1A1A"/>
               </w:rPr>
-              <w:t xml:space="preserve">VÍDEO 7: Churrasco de Espeto, do Jeito Certo</w:t>
+              <w:t xml:space="preserve">VÍDEO 7: Depois da Lida no Quintal</w:t>
             </w:r>
           </w:p>
         </w:tc>
@@ -2559,22 +2994,22 @@
                 <w:bCs/>
                 <w:color w:val="1A1A1A"/>
               </w:rPr>
+              <w:t xml:space="preserve">Farofa Santa Massa</w:t>
+            </w:r>
+          </w:p>
+          <w:p>
+            <w:pPr>
+              <w:spacing w:after="0"/>
+            </w:pPr>
+            <w:r>
+              <w:rPr>
+                <w:b/>
+                <w:bCs/>
+                <w:color w:val="1A1A1A"/>
+              </w:rPr>
               <w:t xml:space="preserve">Pão de Alho Recheado Santa Massa</w:t>
             </w:r>
           </w:p>
-          <w:p>
-            <w:pPr>
-              <w:spacing w:after="0"/>
-            </w:pPr>
-            <w:r>
-              <w:rPr>
-                <w:b/>
-                <w:bCs/>
-                <w:color w:val="1A1A1A"/>
-              </w:rPr>
-              <w:t xml:space="preserve">Farofa Santa Massa</w:t>
-            </w:r>
-          </w:p>
         </w:tc>
         <w:tc>
           <w:tcPr>
@@ -2589,37 +3024,53 @@
           </w:tcPr>
           <w:p>
             <w:pPr>
-              <w:spacing w:after="80"/>
-            </w:pPr>
-            <w:r>
-              <w:rPr>
-                <w:color w:val="1A1A1A"/>
-              </w:rPr>
-              <w:t xml:space="preserve">Foca no ritual do churrasco de espeto em versão caseira: carne no espeto sendo virada na churrasqueira doméstica, brasa em destaque, sal grosso sendo aplicado.</w:t>
-            </w:r>
-          </w:p>
-          <w:p>
-            <w:pPr>
-              <w:spacing w:after="80"/>
-            </w:pPr>
-            <w:r>
-              <w:rPr>
-                <w:color w:val="1A1A1A"/>
-              </w:rPr>
-              <w:t xml:space="preserve">Fecha o prato com a farofa e o pão de alho Santa Massa entrando em quadro, reforçando que o ritual do espeto continua sendo tradição mesmo numa churrasqueira simples.</w:t>
-            </w:r>
-          </w:p>
-          <w:p>
-            <w:pPr>
-              <w:spacing w:after="80"/>
-            </w:pPr>
-            <w:r>
-              <w:rPr>
-                <w:b/>
-                <w:bCs/>
-                <w:color w:val="1A1A1A"/>
-              </w:rPr>
-              <w:t xml:space="preserve">Lettering:</w:t>
+              <w:spacing w:after="80" w:before="0"/>
+            </w:pPr>
+            <w:r>
+              <w:rPr>
+                <w:b/>
+                <w:bCs/>
+                <w:color w:val="1A1A1A"/>
+              </w:rPr>
+              <w:t xml:space="preserve">Ocasião de consumo: </w:t>
+            </w:r>
+            <w:r>
+              <w:rPr>
+                <w:color w:val="1A1A1A"/>
+              </w:rPr>
+              <w:t xml:space="preserve">Final de tarde após um esforço físico leve em casa (cuidar da horta, cortar grama, arrumar o quintal) — a recompensa de uma refeição completa.</w:t>
+            </w:r>
+          </w:p>
+          <w:p>
+            <w:pPr>
+              <w:spacing w:after="80" w:before="0"/>
+            </w:pPr>
+            <w:r>
+              <w:rPr>
+                <w:b/>
+                <w:bCs/>
+                <w:color w:val="1A1A1A"/>
+              </w:rPr>
+              <w:t xml:space="preserve">Apetite appeal: </w:t>
+            </w:r>
+            <w:r>
+              <w:rPr>
+                <w:color w:val="1A1A1A"/>
+              </w:rPr>
+              <w:t xml:space="preserve">Prato fumegante esperando na mesa, garfada satisfeita, corte mostrando fartura (carne, farofa crocante e pão de alho lado a lado).</w:t>
+            </w:r>
+          </w:p>
+          <w:p>
+            <w:pPr>
+              <w:spacing w:after="80"/>
+            </w:pPr>
+            <w:r>
+              <w:rPr>
+                <w:b/>
+                <w:bCs/>
+                <w:color w:val="1A1A1A"/>
+              </w:rPr>
+              <w:t xml:space="preserve">Cena a cena:</w:t>
             </w:r>
           </w:p>
           <w:p>
@@ -2635,7 +3086,84 @@
               <w:rPr>
                 <w:color w:val="1A1A1A"/>
               </w:rPr>
-              <w:t xml:space="preserve">"ESPETO NA BRASA, PÃO DE ALHO E FAROFA NA MESA — TRADIÇÃO NÃO PERGUNTA ONDE."</w:t>
+              <w:t xml:space="preserve">Alguém terminando uma tarefa no quintal (regar plantas, guardar ferramentas), visivelmente cansado mas satisfeito.</w:t>
+            </w:r>
+          </w:p>
+          <w:p>
+            <w:pPr>
+              <w:pStyle w:val="ListParagraph"/>
+              <w:numPr>
+                <w:ilvl w:val="0"/>
+                <w:numId w:val="2"/>
+              </w:numPr>
+              <w:spacing w:after="60"/>
+            </w:pPr>
+            <w:r>
+              <w:rPr>
+                <w:color w:val="1A1A1A"/>
+              </w:rPr>
+              <w:t xml:space="preserve">Corte para o prato pronto na mesa, com carne, farofa Santa Massa e pão de alho — still com vapor visível.</w:t>
+            </w:r>
+          </w:p>
+          <w:p>
+            <w:pPr>
+              <w:pStyle w:val="ListParagraph"/>
+              <w:numPr>
+                <w:ilvl w:val="0"/>
+                <w:numId w:val="2"/>
+              </w:numPr>
+              <w:spacing w:after="60"/>
+            </w:pPr>
+            <w:r>
+              <w:rPr>
+                <w:color w:val="1A1A1A"/>
+              </w:rPr>
+              <w:t xml:space="preserve">Primeira garfada, expressão de alívio e satisfação.</w:t>
+            </w:r>
+          </w:p>
+          <w:p>
+            <w:pPr>
+              <w:pStyle w:val="ListParagraph"/>
+              <w:numPr>
+                <w:ilvl w:val="0"/>
+                <w:numId w:val="2"/>
+              </w:numPr>
+              <w:spacing w:after="60"/>
+            </w:pPr>
+            <w:r>
+              <w:rPr>
+                <w:color w:val="1A1A1A"/>
+              </w:rPr>
+              <w:t xml:space="preserve">Fecha com a pessoa se acomodando pra uma sesteada depois de comer.</w:t>
+            </w:r>
+          </w:p>
+          <w:p>
+            <w:pPr>
+              <w:spacing w:after="80"/>
+            </w:pPr>
+            <w:r>
+              <w:rPr>
+                <w:b/>
+                <w:bCs/>
+                <w:color w:val="1A1A1A"/>
+              </w:rPr>
+              <w:t xml:space="preserve">Lettering:</w:t>
+            </w:r>
+          </w:p>
+          <w:p>
+            <w:pPr>
+              <w:pStyle w:val="ListParagraph"/>
+              <w:numPr>
+                <w:ilvl w:val="0"/>
+                <w:numId w:val="2"/>
+              </w:numPr>
+              <w:spacing w:after="60"/>
+            </w:pPr>
+            <w:r>
+              <w:rPr>
+                <w:color w:val="1A1A1A"/>
+              </w:rPr>
+              <w:t xml:space="preserve">"TRABALHOU, COMEU BEM, AGORA É HORA DA SESTEADA."</w:t>
             </w:r>
           </w:p>
           <w:p>
@@ -2650,7 +3178,7 @@
               <w:t xml:space="preserve">Texto no vídeo: </w:t>
             </w:r>
             <w:r>
-              <w:t xml:space="preserve">ESPETO NA BRASA, PÃO DE ALHO E FAROFA NA MESA — TRADIÇÃO NÃO PERGUNTA ONDE.</w:t>
+              <w:t xml:space="preserve">TRABALHOU, COMEU BEM, AGORA É HORA DA SESTEADA.</w:t>
             </w:r>
           </w:p>
         </w:tc>
@@ -2675,7 +3203,7 @@
                 <w:iCs/>
                 <w:color w:val="555555"/>
               </w:rPr>
-              <w:t xml:space="preserve">Buscar referência: Reels estilo "processo completo do churrasco" (carne + acompanhamentos, câmera em movimento).</w:t>
+              <w:t xml:space="preserve">Buscar referência: Reels de "recompensa depois do esforço físico" — rotina doméstica seguida de refeição farta.</w:t>
             </w:r>
           </w:p>
         </w:tc>
@@ -2700,7 +3228,7 @@
                 <w:iCs/>
                 <w:color w:val="555555"/>
               </w:rPr>
-              <w:t xml:space="preserve">Plano geral do espeto na churrasqueira, seguido de close no prato final montado.</w:t>
+              <w:t xml:space="preserve">Transição de esforço (suor, cansaço) para conforto (mesa farta, prato fumegante, corpo relaxando).</w:t>
             </w:r>
           </w:p>
         </w:tc>
@@ -2721,7 +3249,7 @@
           <w:iCs/>
           <w:color w:val="555555"/>
         </w:rPr>
-        <w:t xml:space="preserve">Observação geral: como nenhuma gravação ocorrerá no Acampamento Farroupilha, todos os roteiros acima foram desenhados para ambientes domésticos (churrasqueira/varanda, cozinha, mesa) ou espaços públicos simples (praça, área de churrasqueira coletiva), sem elenco fixo em traje típico e sem figuração de desfile.</w:t>
+        <w:t xml:space="preserve">Observação geral: como nenhuma gravação ocorrerá no Acampamento Farroupilha, todos os roteiros acima foram desenhados para ambientes domésticos ou espaços públicos simples, sem elenco fixo em traje típico e sem figuração de desfile. Cada vídeo usa uma ocasião de consumo diferente para evitar repetição, mantendo sempre o apetite appeal do produto em primeiro plano.</w:t>
       </w:r>
     </w:p>
     <w:sectPr>

</xml_diff>

<commit_message>
Foco no pao de alho, corrige uso da farofa como tempero, amplia vocabulario gaucho, reescreve Parabens Gauderio com virada narrativa
</commit_message>
<xml_diff>
--- a/Roteiro_Situacoes_Tipicas_Gauchas_Santa_Massa.docx
+++ b/Roteiro_Situacoes_Tipicas_Gauchas_Santa_Massa.docx
@@ -59,7 +59,7 @@
           <w:iCs/>
           <w:color w:val="555555"/>
         </w:rPr>
-        <w:t xml:space="preserve">Bloco: "Situações Típicas Gaúchas" — cada vídeo parte de uma ocasião de consumo real e distinta (não só churrasco), sempre evidenciando o apetite appeal do produto e um traço da cultura gaúcha. Gravação em casa ou em locais públicos simples, antes do Acampamento Farroupilha.</w:t>
+        <w:t xml:space="preserve">Bloco: "Situações Típicas Gaúchas" — Pão de Alho Recheado Santa Massa como produto foco em praticamente todos os vídeos; a Farofa Santa Massa aparece só como tempero polvilhado sobre a carne, nunca como prato à parte. Cada vídeo parte de uma ocasião de consumo real e distinta, evidenciando o apetite appeal do produto e um traço/vocabulário da cultura gaúcha. Gravação em casa ou em locais públicos simples, antes do Acampamento Farroupilha.</w:t>
       </w:r>
     </w:p>
     <w:p>
@@ -89,7 +89,7 @@
         <w:rPr>
           <w:color w:val="1A1A1A"/>
         </w:rPr>
-        <w:t xml:space="preserve">Nos conteúdos da Santa Massa, é essencial que o pão e a farofa apareçam sempre com aparência fresca e apetitosa (douradinho, recheio visível, crocância evidente), sem estar queimado, pálido ou murcho.</w:t>
+        <w:t xml:space="preserve">O produto foco destes roteiros é o Pão de Alho Recheado Santa Massa — ele deve ser o protagonista visual em todos os vídeos, aparecendo sempre douradinho, com recheio visível e apetitoso, sem estar queimado ou pálido.</w:t>
       </w:r>
     </w:p>
     <w:p>
@@ -105,7 +105,7 @@
         <w:rPr>
           <w:color w:val="1A1A1A"/>
         </w:rPr>
-        <w:t xml:space="preserve">Cada vídeo deve evidenciar o apetite appeal do produto (textura, vapor, brilho, queijo escorrendo, som de crocância) e deixar clara a ocasião de consumo — quando, com quem e por que se come aquilo.</w:t>
+        <w:t xml:space="preserve">A Farofa Santa Massa NÃO é reaquecida ou servida como prato à parte: ela é sempre um tempero/acompanhamento polvilhado por cima da carne já fatiada. Sempre que aparecer, mostrar esse uso correto (polvilhando sobre a carne), nunca sozinha numa panela ou frigideira.</w:t>
       </w:r>
     </w:p>
     <w:p>
@@ -121,7 +121,7 @@
         <w:rPr>
           <w:color w:val="1A1A1A"/>
         </w:rPr>
-        <w:t xml:space="preserve">As imagens do produto, sejam fotos ou vídeos, devem ser feitas imediatamente após o preparo. Caso o produto fique exposto por algum tempo, preparar uma nova unidade antes de seguir com a captura.</w:t>
+        <w:t xml:space="preserve">Cada vídeo deve evidenciar o apetite appeal do produto (textura, vapor, brilho, queijo escorrendo) e deixar clara a ocasião de consumo — quando, com quem e por que se come aquilo.</w:t>
       </w:r>
     </w:p>
     <w:p>
@@ -137,7 +137,7 @@
         <w:rPr>
           <w:color w:val="1A1A1A"/>
         </w:rPr>
-        <w:t xml:space="preserve">Todos os elementos de cena (pratos, panelas, talheres, utensílios) devem estar limpos e em bom estado.</w:t>
+        <w:t xml:space="preserve">As imagens do produto, sejam fotos ou vídeos, devem ser feitas imediatamente após o preparo. Caso o produto fique exposto por algum tempo, preparar uma nova unidade antes de seguir com a captura.</w:t>
       </w:r>
     </w:p>
     <w:p>
@@ -153,7 +153,7 @@
         <w:rPr>
           <w:color w:val="1A1A1A"/>
         </w:rPr>
-        <w:t xml:space="preserve">Sempre que possível, incluir as embalagens dos produtos nas cenas para reforçar a presença da marca, desde que estejam em boas condições visuais.</w:t>
+        <w:t xml:space="preserve">Todos os elementos de cena (pratos, panelas, talheres, utensílios) devem estar limpos e em bom estado.</w:t>
       </w:r>
     </w:p>
     <w:p>
@@ -169,7 +169,7 @@
         <w:rPr>
           <w:color w:val="1A1A1A"/>
         </w:rPr>
-        <w:t xml:space="preserve">Evitar rasgar as embalagens — usar tesoura/faca para abrir.</w:t>
+        <w:t xml:space="preserve">Sempre que possível, incluir as embalagens dos produtos nas cenas para reforçar a presença da marca, desde que estejam em boas condições visuais.</w:t>
       </w:r>
     </w:p>
     <w:p>
@@ -185,7 +185,7 @@
         <w:rPr>
           <w:color w:val="1A1A1A"/>
         </w:rPr>
-        <w:t xml:space="preserve">Como a gravação será em casa ou em local público (não no Acampamento Farroupilha), priorizar ambientes bem iluminados, limpos e organizados, evitando elementos que revelem claramente que a cena não é o piquete.</w:t>
+        <w:t xml:space="preserve">Evitar rasgar as embalagens — usar tesoura/faca para abrir.</w:t>
       </w:r>
     </w:p>
     <w:p>
@@ -201,7 +201,7 @@
         <w:rPr>
           <w:color w:val="1A1A1A"/>
         </w:rPr>
-        <w:t xml:space="preserve">Cada vídeo deve ser gravado em um ambiente/enquadramento diferente dentro de casa para manter o conteúdo dinâmico e evitar repetição visual — e cada situação deve trazer uma ocasião de consumo distinta (não repetir sempre o contexto de churrasco).</w:t>
+        <w:t xml:space="preserve">Como a gravação será em casa ou em local público (não no Acampamento Farroupilha), priorizar ambientes bem iluminados, limpos e organizados, evitando elementos que revelem claramente que a cena não é o piquete.</w:t>
       </w:r>
     </w:p>
     <w:p>
@@ -217,7 +217,23 @@
         <w:rPr>
           <w:color w:val="1A1A1A"/>
         </w:rPr>
-        <w:t xml:space="preserve">As gírias gaúchas usadas nos letterings devem aparecer com clareza de sentido pelo contexto da cena, mesmo sem tradução literal na tela, para não quebrar o tom natural do vídeo.</w:t>
+        <w:t xml:space="preserve">Cada vídeo deve ser gravado em um ambiente/enquadramento diferente dentro de casa para manter o conteúdo dinâmico, e cada situação deve trazer uma ocasião de consumo distinta.</w:t>
+      </w:r>
+    </w:p>
+    <w:p>
+      <w:pPr>
+        <w:pStyle w:val="ListParagraph"/>
+        <w:numPr>
+          <w:ilvl w:val="0"/>
+          <w:numId w:val="2"/>
+        </w:numPr>
+        <w:spacing w:after="60"/>
+      </w:pPr>
+      <w:r>
+        <w:rPr>
+          <w:color w:val="1A1A1A"/>
+        </w:rPr>
+        <w:t xml:space="preserve">As gírias gaúchas usadas nos letterings e diálogos devem ficar claras pelo contexto da cena, mesmo sem tradução literal na tela, para não quebrar o tom natural do vídeo (exceto no formato de curiosidade do Vídeo 4, onde a explicação é o próprio conteúdo).</w:t>
       </w:r>
     </w:p>
     <w:p>
@@ -284,7 +300,7 @@
         <w:rPr>
           <w:color w:val="1A1A1A"/>
         </w:rPr>
-        <w:t xml:space="preserve">FACEIRO — Feliz, satisfeito, orgulhoso do resultado.</w:t>
+        <w:t xml:space="preserve">BAH — Interjeição de surpresa, espanto ou ênfase — usada o tempo todo no dia a dia gaúcho.</w:t>
       </w:r>
     </w:p>
     <w:p>
@@ -300,7 +316,7 @@
         <w:rPr>
           <w:color w:val="1A1A1A"/>
         </w:rPr>
-        <w:t xml:space="preserve">PILA — Dinheiro, real (ex: "vale uma pila" = vale a pena, é barato pelo que entrega).</w:t>
+        <w:t xml:space="preserve">TCHÊ — Forma de chamar alguém, equivalente a "cara"/"mano" em outras regiões.</w:t>
       </w:r>
     </w:p>
     <w:p>
@@ -316,7 +332,7 @@
         <w:rPr>
           <w:color w:val="1A1A1A"/>
         </w:rPr>
-        <w:t xml:space="preserve">SESTEAR / SESTEADA — Tirar uma soneca, cochilo — geralmente depois de uma refeição farta.</w:t>
+        <w:t xml:space="preserve">SANGA — Vala, valeta, pequeno curso d'água — usada aqui de forma figurada/exagerada.</w:t>
       </w:r>
     </w:p>
     <w:p>
@@ -333,6 +349,134 @@
           <w:color w:val="1A1A1A"/>
         </w:rPr>
         <w:t xml:space="preserve">GAUDÉRIO — Termo tradicionalista para o gaúcho, o andarilho do campo — origem histórica da figura do gaúcho.</w:t>
+      </w:r>
+    </w:p>
+    <w:p>
+      <w:pPr>
+        <w:pStyle w:val="ListParagraph"/>
+        <w:numPr>
+          <w:ilvl w:val="0"/>
+          <w:numId w:val="2"/>
+        </w:numPr>
+        <w:spacing w:after="60"/>
+      </w:pPr>
+      <w:r>
+        <w:rPr>
+          <w:color w:val="1A1A1A"/>
+        </w:rPr>
+        <w:t xml:space="preserve">CUSCO — Cachorro (geralmente pequeno/vira-lata).</w:t>
+      </w:r>
+    </w:p>
+    <w:p>
+      <w:pPr>
+        <w:pStyle w:val="ListParagraph"/>
+        <w:numPr>
+          <w:ilvl w:val="0"/>
+          <w:numId w:val="2"/>
+        </w:numPr>
+        <w:spacing w:after="60"/>
+      </w:pPr>
+      <w:r>
+        <w:rPr>
+          <w:color w:val="1A1A1A"/>
+        </w:rPr>
+        <w:t xml:space="preserve">FIASCO — Confusão, bagunça, situação de escândalo — "deu um fiasco".</w:t>
+      </w:r>
+    </w:p>
+    <w:p>
+      <w:pPr>
+        <w:pStyle w:val="ListParagraph"/>
+        <w:numPr>
+          <w:ilvl w:val="0"/>
+          <w:numId w:val="2"/>
+        </w:numPr>
+        <w:spacing w:after="60"/>
+      </w:pPr>
+      <w:r>
+        <w:rPr>
+          <w:color w:val="1A1A1A"/>
+        </w:rPr>
+        <w:t xml:space="preserve">CHINELAGEM — Sacanagem, brincadeira de mau gosto.</w:t>
+      </w:r>
+    </w:p>
+    <w:p>
+      <w:pPr>
+        <w:pStyle w:val="ListParagraph"/>
+        <w:numPr>
+          <w:ilvl w:val="0"/>
+          <w:numId w:val="2"/>
+        </w:numPr>
+        <w:spacing w:after="60"/>
+      </w:pPr>
+      <w:r>
+        <w:rPr>
+          <w:color w:val="1A1A1A"/>
+        </w:rPr>
+        <w:t xml:space="preserve">BRIGADIANO — Policial militar (referência à Brigada Militar do RS).</w:t>
+      </w:r>
+    </w:p>
+    <w:p>
+      <w:pPr>
+        <w:pStyle w:val="ListParagraph"/>
+        <w:numPr>
+          <w:ilvl w:val="0"/>
+          <w:numId w:val="2"/>
+        </w:numPr>
+        <w:spacing w:after="60"/>
+      </w:pPr>
+      <w:r>
+        <w:rPr>
+          <w:color w:val="1A1A1A"/>
+        </w:rPr>
+        <w:t xml:space="preserve">PILA — Dinheiro, real (ex: "vale uma pila" = vale a pena, é barato pelo que entrega).</w:t>
+      </w:r>
+    </w:p>
+    <w:p>
+      <w:pPr>
+        <w:pStyle w:val="ListParagraph"/>
+        <w:numPr>
+          <w:ilvl w:val="0"/>
+          <w:numId w:val="2"/>
+        </w:numPr>
+        <w:spacing w:after="60"/>
+      </w:pPr>
+      <w:r>
+        <w:rPr>
+          <w:color w:val="1A1A1A"/>
+        </w:rPr>
+        <w:t xml:space="preserve">ESCULHAMBADO — Bagunçado, desarrumado.</w:t>
+      </w:r>
+    </w:p>
+    <w:p>
+      <w:pPr>
+        <w:pStyle w:val="ListParagraph"/>
+        <w:numPr>
+          <w:ilvl w:val="0"/>
+          <w:numId w:val="2"/>
+        </w:numPr>
+        <w:spacing w:after="60"/>
+      </w:pPr>
+      <w:r>
+        <w:rPr>
+          <w:color w:val="1A1A1A"/>
+        </w:rPr>
+        <w:t xml:space="preserve">SESTEAR / SESTEADA — Tirar uma soneca, cochilo — geralmente depois de uma refeição farta.</w:t>
+      </w:r>
+    </w:p>
+    <w:p>
+      <w:pPr>
+        <w:pStyle w:val="ListParagraph"/>
+        <w:numPr>
+          <w:ilvl w:val="0"/>
+          <w:numId w:val="2"/>
+        </w:numPr>
+        <w:spacing w:after="60"/>
+      </w:pPr>
+      <w:r>
+        <w:rPr>
+          <w:color w:val="1A1A1A"/>
+        </w:rPr>
+        <w:t xml:space="preserve">FACEIRO — Feliz, satisfeito, orgulhoso do resultado.</w:t>
       </w:r>
     </w:p>
     <w:p>
@@ -353,8 +497,8 @@
         </w:tblBorders>
       </w:tblPr>
       <w:tblGrid>
-        <w:gridCol w:w="1900"/>
-        <w:gridCol w:w="4500"/>
+        <w:gridCol w:w="2100"/>
+        <w:gridCol w:w="4300"/>
         <w:gridCol w:w="1900"/>
         <w:gridCol w:w="1940"/>
       </w:tblGrid>
@@ -390,7 +534,7 @@
       <w:tr>
         <w:tc>
           <w:tcPr>
-            <w:tcW w:type="dxa" w:w="1900"/>
+            <w:tcW w:type="dxa" w:w="2100"/>
             <w:tcMar>
               <w:top w:type="dxa" w:w="100"/>
               <w:left w:type="dxa" w:w="100"/>
@@ -415,7 +559,7 @@
         </w:tc>
         <w:tc>
           <w:tcPr>
-            <w:tcW w:type="dxa" w:w="4500"/>
+            <w:tcW w:type="dxa" w:w="4300"/>
             <w:tcMar>
               <w:top w:type="dxa" w:w="100"/>
               <w:left w:type="dxa" w:w="100"/>
@@ -492,28 +636,15 @@
       <w:tr>
         <w:tc>
           <w:tcPr>
-            <w:tcW w:type="dxa" w:w="1900"/>
-            <w:tcMar>
-              <w:top w:type="dxa" w:w="100"/>
-              <w:left w:type="dxa" w:w="100"/>
-              <w:bottom w:type="dxa" w:w="100"/>
-              <w:right w:type="dxa" w:w="100"/>
-            </w:tcMar>
-            <w:vAlign w:val="top"/>
-          </w:tcPr>
-          <w:p>
-            <w:pPr>
-              <w:spacing w:after="60"/>
-            </w:pPr>
-            <w:r>
-              <w:rPr>
-                <w:b/>
-                <w:bCs/>
-                <w:color w:val="1A1A1A"/>
-              </w:rPr>
-              <w:t xml:space="preserve">Farofa Santa Massa</w:t>
-            </w:r>
-          </w:p>
+            <w:tcW w:type="dxa" w:w="2100"/>
+            <w:tcMar>
+              <w:top w:type="dxa" w:w="100"/>
+              <w:left w:type="dxa" w:w="100"/>
+              <w:bottom w:type="dxa" w:w="100"/>
+              <w:right w:type="dxa" w:w="100"/>
+            </w:tcMar>
+            <w:vAlign w:val="top"/>
+          </w:tcPr>
           <w:p>
             <w:pPr>
               <w:spacing w:after="0"/>
@@ -530,7 +661,7 @@
         </w:tc>
         <w:tc>
           <w:tcPr>
-            <w:tcW w:type="dxa" w:w="4500"/>
+            <w:tcW w:type="dxa" w:w="4300"/>
             <w:tcMar>
               <w:top w:type="dxa" w:w="100"/>
               <w:left w:type="dxa" w:w="100"/>
@@ -555,7 +686,7 @@
               <w:rPr>
                 <w:color w:val="1A1A1A"/>
               </w:rPr>
-              <w:t xml:space="preserve">Almoço de domingo em família — o momento em que a casa inteira já sabe que a comida tá quase pronta só pelo cheiro.</w:t>
+              <w:t xml:space="preserve">Almoço de domingo em família — o momento em que a casa inteira já sabe que o almoço tá quase pronto só pelo cheiro.</w:t>
             </w:r>
           </w:p>
           <w:p>
@@ -574,7 +705,7 @@
               <w:rPr>
                 <w:color w:val="1A1A1A"/>
               </w:rPr>
-              <w:t xml:space="preserve">Vapor subindo da farofa quente na panela; corte do pão de alho puxando queijo derretido em câmera mais lenta; brilho de manteiga/azeite refletindo luz.</w:t>
+              <w:t xml:space="preserve">Vapor subindo do pão de alho recém-saído da grelha; corte puxando queijo derretido em câmera mais lenta; brilho de manteiga refletindo luz.</w:t>
             </w:r>
           </w:p>
           <w:p>
@@ -603,55 +734,55 @@
               <w:rPr>
                 <w:color w:val="1A1A1A"/>
               </w:rPr>
-              <w:t xml:space="preserve">Plano aberto de uma casa/quintal num domingo comum. Alguém para no meio do corredor, cheirando o ar, com uma expressão de "peraí, que cheiro é esse?".</w:t>
-            </w:r>
-          </w:p>
-          <w:p>
-            <w:pPr>
-              <w:pStyle w:val="ListParagraph"/>
-              <w:numPr>
-                <w:ilvl w:val="0"/>
-                <w:numId w:val="2"/>
-              </w:numPr>
-              <w:spacing w:after="60"/>
-            </w:pPr>
-            <w:r>
-              <w:rPr>
-                <w:color w:val="1A1A1A"/>
-              </w:rPr>
-              <w:t xml:space="preserve">Corte para a cozinha/churrasqueira: farofa Santa Massa sendo finalizada na panela, vapor bem visível.</w:t>
-            </w:r>
-          </w:p>
-          <w:p>
-            <w:pPr>
-              <w:pStyle w:val="ListParagraph"/>
-              <w:numPr>
-                <w:ilvl w:val="0"/>
-                <w:numId w:val="2"/>
-              </w:numPr>
-              <w:spacing w:after="60"/>
-            </w:pPr>
-            <w:r>
-              <w:rPr>
-                <w:color w:val="1A1A1A"/>
-              </w:rPr>
-              <w:t xml:space="preserve">Close no pão de alho sendo partido ao meio, puxando queijo — câmera levemente em slow motion para valorizar a textura.</w:t>
-            </w:r>
-          </w:p>
-          <w:p>
-            <w:pPr>
-              <w:pStyle w:val="ListParagraph"/>
-              <w:numPr>
-                <w:ilvl w:val="0"/>
-                <w:numId w:val="2"/>
-              </w:numPr>
-              <w:spacing w:after="60"/>
-            </w:pPr>
-            <w:r>
-              <w:rPr>
-                <w:color w:val="1A1A1A"/>
-              </w:rPr>
-              <w:t xml:space="preserve">Mesa sendo montada, família se aproximando puxada pelo cheiro.</w:t>
+              <w:t xml:space="preserve">Plano aberto de uma casa num domingo comum. Alguém para no meio do corredor, cheirando o ar, com uma expressão de "bah, que cheiro é esse?".</w:t>
+            </w:r>
+          </w:p>
+          <w:p>
+            <w:pPr>
+              <w:pStyle w:val="ListParagraph"/>
+              <w:numPr>
+                <w:ilvl w:val="0"/>
+                <w:numId w:val="2"/>
+              </w:numPr>
+              <w:spacing w:after="60"/>
+            </w:pPr>
+            <w:r>
+              <w:rPr>
+                <w:color w:val="1A1A1A"/>
+              </w:rPr>
+              <w:t xml:space="preserve">Corte para a cozinha/churrasqueira: pão de alho Santa Massa saindo da grelha, vapor bem visível.</w:t>
+            </w:r>
+          </w:p>
+          <w:p>
+            <w:pPr>
+              <w:pStyle w:val="ListParagraph"/>
+              <w:numPr>
+                <w:ilvl w:val="0"/>
+                <w:numId w:val="2"/>
+              </w:numPr>
+              <w:spacing w:after="60"/>
+            </w:pPr>
+            <w:r>
+              <w:rPr>
+                <w:color w:val="1A1A1A"/>
+              </w:rPr>
+              <w:t xml:space="preserve">Fatia sendo cortada, puxando queijo — câmera levemente em slow motion para valorizar a textura.</w:t>
+            </w:r>
+          </w:p>
+          <w:p>
+            <w:pPr>
+              <w:pStyle w:val="ListParagraph"/>
+              <w:numPr>
+                <w:ilvl w:val="0"/>
+                <w:numId w:val="2"/>
+              </w:numPr>
+              <w:spacing w:after="60"/>
+            </w:pPr>
+            <w:r>
+              <w:rPr>
+                <w:color w:val="1A1A1A"/>
+              </w:rPr>
+              <w:t xml:space="preserve">Alguém de outro cômodo praticamente atravessa a casa correndo — exagero de brincadeira, tipo "parece que atravessou uma sanga pra chegar rápido".</w:t>
             </w:r>
           </w:p>
           <w:p>
@@ -761,7 +892,7 @@
                 <w:iCs/>
                 <w:color w:val="555555"/>
               </w:rPr>
-              <w:t xml:space="preserve">Transição do olfato (expressão facial) para a origem do cheiro (panela/grelha), fechando na mesa montada.</w:t>
+              <w:t xml:space="preserve">Transição do olfato (expressão facial) para a origem do cheiro (grelha), fechando na mesa montada.</w:t>
             </w:r>
           </w:p>
         </w:tc>
@@ -785,8 +916,8 @@
         </w:tblBorders>
       </w:tblPr>
       <w:tblGrid>
-        <w:gridCol w:w="1900"/>
-        <w:gridCol w:w="4500"/>
+        <w:gridCol w:w="2100"/>
+        <w:gridCol w:w="4300"/>
         <w:gridCol w:w="1900"/>
         <w:gridCol w:w="1940"/>
       </w:tblGrid>
@@ -822,7 +953,7 @@
       <w:tr>
         <w:tc>
           <w:tcPr>
-            <w:tcW w:type="dxa" w:w="1900"/>
+            <w:tcW w:type="dxa" w:w="2100"/>
             <w:tcMar>
               <w:top w:type="dxa" w:w="100"/>
               <w:left w:type="dxa" w:w="100"/>
@@ -847,7 +978,7 @@
         </w:tc>
         <w:tc>
           <w:tcPr>
-            <w:tcW w:type="dxa" w:w="4500"/>
+            <w:tcW w:type="dxa" w:w="4300"/>
             <w:tcMar>
               <w:top w:type="dxa" w:w="100"/>
               <w:left w:type="dxa" w:w="100"/>
@@ -924,18 +1055,18 @@
       <w:tr>
         <w:tc>
           <w:tcPr>
-            <w:tcW w:type="dxa" w:w="1900"/>
-            <w:tcMar>
-              <w:top w:type="dxa" w:w="100"/>
-              <w:left w:type="dxa" w:w="100"/>
-              <w:bottom w:type="dxa" w:w="100"/>
-              <w:right w:type="dxa" w:w="100"/>
-            </w:tcMar>
-            <w:vAlign w:val="top"/>
-          </w:tcPr>
-          <w:p>
-            <w:pPr>
-              <w:spacing w:after="60"/>
+            <w:tcW w:type="dxa" w:w="2100"/>
+            <w:tcMar>
+              <w:top w:type="dxa" w:w="100"/>
+              <w:left w:type="dxa" w:w="100"/>
+              <w:bottom w:type="dxa" w:w="100"/>
+              <w:right w:type="dxa" w:w="100"/>
+            </w:tcMar>
+            <w:vAlign w:val="top"/>
+          </w:tcPr>
+          <w:p>
+            <w:pPr>
+              <w:spacing w:after="0"/>
             </w:pPr>
             <w:r>
               <w:rPr>
@@ -946,23 +1077,10 @@
               <w:t xml:space="preserve">Pão de Alho Recheado Santa Massa</w:t>
             </w:r>
           </w:p>
-          <w:p>
-            <w:pPr>
-              <w:spacing w:after="0"/>
-            </w:pPr>
-            <w:r>
-              <w:rPr>
-                <w:b/>
-                <w:bCs/>
-                <w:color w:val="1A1A1A"/>
-              </w:rPr>
-              <w:t xml:space="preserve">Farofa Santa Massa</w:t>
-            </w:r>
-          </w:p>
-        </w:tc>
-        <w:tc>
-          <w:tcPr>
-            <w:tcW w:type="dxa" w:w="4500"/>
+        </w:tc>
+        <w:tc>
+          <w:tcPr>
+            <w:tcW w:type="dxa" w:w="4300"/>
             <w:tcMar>
               <w:top w:type="dxa" w:w="100"/>
               <w:left w:type="dxa" w:w="100"/>
@@ -989,7 +1107,7 @@
                 <w:iCs/>
                 <w:color w:val="1A1A1A"/>
               </w:rPr>
-              <w:t xml:space="preserve">"Gaudério" é o termo tradicionalista mais antigo para o gaúcho — o andarilho do campo que deu origem à figura do gaúcho como conhecemos. É comum, em CTGs e famílias tradicionalistas, chamar quem faz aniversário carinhosamente de "gaudério(a)" na hora de cantar o parabéns regional, composto em ritmo de xote por Dimas Costa e Eleu Salvador em 1958, que substitui o parabéns tradicional nas festas do estado.</w:t>
+              <w:t xml:space="preserve">"Gaudério" é o termo tradicionalista mais antigo para o gaúcho — o andarilho do campo que deu origem à figura do gaúcho como conhecemos. Em famílias e CTGs tradicionalistas, além do parabéns comum, costuma-se cantar a canção regional em ritmo de xote, composta por Dimas Costa e Eleu Salvador em 1958. Este roteiro usa uma virada de chave: começa como um aniversário qualquer e só depois revela o contexto gaúcho — e o pão de alho no meio dele.</w:t>
             </w:r>
           </w:p>
           <w:p>
@@ -1008,7 +1126,7 @@
               <w:rPr>
                 <w:color w:val="1A1A1A"/>
               </w:rPr>
-              <w:t xml:space="preserve">Aniversário em casa ou em família de tradição gaúcha — o momento do parabéns antes de cortar o bolo, com a mesa de comida já servida ao lado.</w:t>
+              <w:t xml:space="preserve">Aniversário em família de tradição gaúcha — o momento do parabéns antes de cortar o bolo.</w:t>
             </w:r>
           </w:p>
           <w:p>
@@ -1027,7 +1145,7 @@
               <w:rPr>
                 <w:color w:val="1A1A1A"/>
               </w:rPr>
-              <w:t xml:space="preserve">Mesa de aniversário farta, com o prato de pão de alho e a travessa de farofa brilhando ao lado do bolo; fumaça leve ainda saindo do pão recém-tirado da grelha.</w:t>
+              <w:t xml:space="preserve">No corte de virada, a travessa de pão de alho aparece brilhando ao lado do bolo, ainda com vapor leve — o salgado quente rouba a cena do doce.</w:t>
             </w:r>
           </w:p>
           <w:p>
@@ -1056,55 +1174,55 @@
               <w:rPr>
                 <w:color w:val="1A1A1A"/>
               </w:rPr>
-              <w:t xml:space="preserve">Mesa de aniversário em casa, com bolo, mas também com uma travessa de pão de alho e farofa Santa Massa em destaque ao lado — deixando claro que ali também tem festa de comida boa.</w:t>
-            </w:r>
-          </w:p>
-          <w:p>
-            <w:pPr>
-              <w:pStyle w:val="ListParagraph"/>
-              <w:numPr>
-                <w:ilvl w:val="0"/>
-                <w:numId w:val="2"/>
-              </w:numPr>
-              <w:spacing w:after="60"/>
-            </w:pPr>
-            <w:r>
-              <w:rPr>
-                <w:color w:val="1A1A1A"/>
-              </w:rPr>
-              <w:t xml:space="preserve">Alguém começa a bater palmas fora de quadro (só mãos/ombro), puxando o ritmo de xote da canção.</w:t>
-            </w:r>
-          </w:p>
-          <w:p>
-            <w:pPr>
-              <w:pStyle w:val="ListParagraph"/>
-              <w:numPr>
-                <w:ilvl w:val="0"/>
-                <w:numId w:val="2"/>
-              </w:numPr>
-              <w:spacing w:after="60"/>
-            </w:pPr>
-            <w:r>
-              <w:rPr>
-                <w:color w:val="1A1A1A"/>
-              </w:rPr>
-              <w:t xml:space="preserve">Corte para o prato sendo servido enquanto a trilha "Parabéns Gaudério" toca por cima (sample de 10-15s da música ou versão instrumental licenciada).</w:t>
-            </w:r>
-          </w:p>
-          <w:p>
-            <w:pPr>
-              <w:pStyle w:val="ListParagraph"/>
-              <w:numPr>
-                <w:ilvl w:val="0"/>
-                <w:numId w:val="2"/>
-              </w:numPr>
-              <w:spacing w:after="60"/>
-            </w:pPr>
-            <w:r>
-              <w:rPr>
-                <w:color w:val="1A1A1A"/>
-              </w:rPr>
-              <w:t xml:space="preserve">Still final: prato + embalagens Santa Massa ao lado do bolo, com a letra em overlay estilo karaokê.</w:t>
+              <w:t xml:space="preserve">Abre como um aniversário comum: close no bolo com velinhas, todo mundo cantando o "parabéns pra você" tradicional. Nada ainda sugere que é um aniversário gaúcho.</w:t>
+            </w:r>
+          </w:p>
+          <w:p>
+            <w:pPr>
+              <w:pStyle w:val="ListParagraph"/>
+              <w:numPr>
+                <w:ilvl w:val="0"/>
+                <w:numId w:val="2"/>
+              </w:numPr>
+              <w:spacing w:after="60"/>
+            </w:pPr>
+            <w:r>
+              <w:rPr>
+                <w:color w:val="1A1A1A"/>
+              </w:rPr>
+              <w:t xml:space="preserve">Corte de virada (câmera gira ou dá um swipe rápido): a mesa completa aparece, e do lado do bolo tem uma travessa de pão de alho Santa Massa brilhando.</w:t>
+            </w:r>
+          </w:p>
+          <w:p>
+            <w:pPr>
+              <w:pStyle w:val="ListParagraph"/>
+              <w:numPr>
+                <w:ilvl w:val="0"/>
+                <w:numId w:val="2"/>
+              </w:numPr>
+              <w:spacing w:after="60"/>
+            </w:pPr>
+            <w:r>
+              <w:rPr>
+                <w:color w:val="1A1A1A"/>
+              </w:rPr>
+              <w:t xml:space="preserve">A trilha muda para o ritmo de xote — entra "Parabéns Gaudério/Gaúcho", com a letra em overlay estilo karaokê.</w:t>
+            </w:r>
+          </w:p>
+          <w:p>
+            <w:pPr>
+              <w:pStyle w:val="ListParagraph"/>
+              <w:numPr>
+                <w:ilvl w:val="0"/>
+                <w:numId w:val="2"/>
+              </w:numPr>
+              <w:spacing w:after="60"/>
+            </w:pPr>
+            <w:r>
+              <w:rPr>
+                <w:color w:val="1A1A1A"/>
+              </w:rPr>
+              <w:t xml:space="preserve">Fecha com alguém pegando um pedaço do pão de alho antes mesmo de cortar o bolo.</w:t>
             </w:r>
           </w:p>
           <w:p>
@@ -1133,7 +1251,55 @@
               <w:rPr>
                 <w:color w:val="1A1A1A"/>
               </w:rPr>
+              <w:t xml:space="preserve">"TODO ANIVERSÁRIO TEM BOLO."</w:t>
+            </w:r>
+          </w:p>
+          <w:p>
+            <w:pPr>
+              <w:pStyle w:val="ListParagraph"/>
+              <w:numPr>
+                <w:ilvl w:val="0"/>
+                <w:numId w:val="2"/>
+              </w:numPr>
+              <w:spacing w:after="60"/>
+            </w:pPr>
+            <w:r>
+              <w:rPr>
+                <w:color w:val="1A1A1A"/>
+              </w:rPr>
+              <w:t xml:space="preserve">"MAS AQUI, TAMBÉM TEM ISSO." (revela a travessa de pão de alho)</w:t>
+            </w:r>
+          </w:p>
+          <w:p>
+            <w:pPr>
+              <w:pStyle w:val="ListParagraph"/>
+              <w:numPr>
+                <w:ilvl w:val="0"/>
+                <w:numId w:val="2"/>
+              </w:numPr>
+              <w:spacing w:after="60"/>
+            </w:pPr>
+            <w:r>
+              <w:rPr>
+                <w:color w:val="1A1A1A"/>
+              </w:rPr>
               <w:t xml:space="preserve">"Parabéns, parabéns / Saúde e felicidade / Que tu colhas sempre todo dia / Paz e alegria na lavoura da amizade"</w:t>
+            </w:r>
+          </w:p>
+          <w:p>
+            <w:pPr>
+              <w:pStyle w:val="ListParagraph"/>
+              <w:numPr>
+                <w:ilvl w:val="0"/>
+                <w:numId w:val="2"/>
+              </w:numPr>
+              <w:spacing w:after="60"/>
+            </w:pPr>
+            <w:r>
+              <w:rPr>
+                <w:color w:val="1A1A1A"/>
+              </w:rPr>
+              <w:t xml:space="preserve">"FELIZ ANIVERSÁRIO, GAUDÉRIO(A). PODE COMEÇAR PELO PÃO DE ALHO."</w:t>
             </w:r>
           </w:p>
           <w:p>
@@ -1169,7 +1335,7 @@
               <w:t xml:space="preserve">Texto no vídeo: </w:t>
             </w:r>
             <w:r>
-              <w:t xml:space="preserve">Letra em overlay estilo karaokê (ver lettering) + "FELIZ ANIVERSÁRIO, GAUDÉRIO(A)!"</w:t>
+              <w:t xml:space="preserve">Sequência de virada: "todo aniversário tem bolo" → revela o pão de alho → letra em overlay estilo karaokê → "feliz aniversário, gaudério(a), pode começar pelo pão de alho."</w:t>
             </w:r>
           </w:p>
         </w:tc>
@@ -1194,7 +1360,7 @@
                 <w:iCs/>
                 <w:color w:val="555555"/>
               </w:rPr>
-              <w:t xml:space="preserve">Buscar referência: Reels de aniversário em família com trilha regional, foco na mesa de comida antes do corte do bolo.</w:t>
+              <w:t xml:space="preserve">Buscar referência: Reels com estrutura de "virada"/reveal — parece uma coisa (aniversário comum) e revela outra (contexto regional).</w:t>
             </w:r>
           </w:p>
         </w:tc>
@@ -1219,7 +1385,7 @@
                 <w:iCs/>
                 <w:color w:val="555555"/>
               </w:rPr>
-              <w:t xml:space="preserve">Mesa de aniversário com comida em primeiro plano e bolo ao fundo — inverte o foco usual (bolo em destaque) para valorizar o salgado.</w:t>
+              <w:t xml:space="preserve">Corte seco de virada (swipe ou zoom rápido) no momento em que a mesa é revelada, reforçando o efeito surpresa.</w:t>
             </w:r>
           </w:p>
         </w:tc>
@@ -1243,8 +1409,8 @@
         </w:tblBorders>
       </w:tblPr>
       <w:tblGrid>
-        <w:gridCol w:w="1900"/>
-        <w:gridCol w:w="4500"/>
+        <w:gridCol w:w="2100"/>
+        <w:gridCol w:w="4300"/>
         <w:gridCol w:w="1900"/>
         <w:gridCol w:w="1940"/>
       </w:tblGrid>
@@ -1280,7 +1446,7 @@
       <w:tr>
         <w:tc>
           <w:tcPr>
-            <w:tcW w:type="dxa" w:w="1900"/>
+            <w:tcW w:type="dxa" w:w="2100"/>
             <w:tcMar>
               <w:top w:type="dxa" w:w="100"/>
               <w:left w:type="dxa" w:w="100"/>
@@ -1305,7 +1471,7 @@
         </w:tc>
         <w:tc>
           <w:tcPr>
-            <w:tcW w:type="dxa" w:w="4500"/>
+            <w:tcW w:type="dxa" w:w="4300"/>
             <w:tcMar>
               <w:top w:type="dxa" w:w="100"/>
               <w:left w:type="dxa" w:w="100"/>
@@ -1382,7 +1548,7 @@
       <w:tr>
         <w:tc>
           <w:tcPr>
-            <w:tcW w:type="dxa" w:w="1900"/>
+            <w:tcW w:type="dxa" w:w="2100"/>
             <w:tcMar>
               <w:top w:type="dxa" w:w="100"/>
               <w:left w:type="dxa" w:w="100"/>
@@ -1407,7 +1573,7 @@
         </w:tc>
         <w:tc>
           <w:tcPr>
-            <w:tcW w:type="dxa" w:w="4500"/>
+            <w:tcW w:type="dxa" w:w="4300"/>
             <w:tcMar>
               <w:top w:type="dxa" w:w="100"/>
               <w:left w:type="dxa" w:w="100"/>
@@ -1432,7 +1598,7 @@
               <w:rPr>
                 <w:color w:val="1A1A1A"/>
               </w:rPr>
-              <w:t xml:space="preserve">Tarde de clássico gaúcho na TV — amigos reunidos em casa pra assistir o jogo, comendo algo prático no intervalo.</w:t>
+              <w:t xml:space="preserve">Tarde de clássico gaúcho na TV — amigos reunidos em casa para assistir o jogo, comendo algo prático no intervalo.</w:t>
             </w:r>
           </w:p>
           <w:p>
@@ -1480,55 +1646,55 @@
               <w:rPr>
                 <w:color w:val="1A1A1A"/>
               </w:rPr>
-              <w:t xml:space="preserve">Sala de estar/varanda com a TV ligada (áudio de torcida ao fundo, sem mostrar escudos de time para não parecer patrocínio).</w:t>
-            </w:r>
-          </w:p>
-          <w:p>
-            <w:pPr>
-              <w:pStyle w:val="ListParagraph"/>
-              <w:numPr>
-                <w:ilvl w:val="0"/>
-                <w:numId w:val="2"/>
-              </w:numPr>
-              <w:spacing w:after="60"/>
-            </w:pPr>
-            <w:r>
-              <w:rPr>
-                <w:color w:val="1A1A1A"/>
-              </w:rPr>
-              <w:t xml:space="preserve">Aos gritos de gol/comemoração, corte para a cozinha: pão de alho Santa Massa saindo da grelha.</w:t>
-            </w:r>
-          </w:p>
-          <w:p>
-            <w:pPr>
-              <w:pStyle w:val="ListParagraph"/>
-              <w:numPr>
-                <w:ilvl w:val="0"/>
-                <w:numId w:val="2"/>
-              </w:numPr>
-              <w:spacing w:after="60"/>
-            </w:pPr>
-            <w:r>
-              <w:rPr>
-                <w:color w:val="1A1A1A"/>
-              </w:rPr>
-              <w:t xml:space="preserve">Fatiado na tábua, puxando queijo — close de textura.</w:t>
-            </w:r>
-          </w:p>
-          <w:p>
-            <w:pPr>
-              <w:pStyle w:val="ListParagraph"/>
-              <w:numPr>
-                <w:ilvl w:val="0"/>
-                <w:numId w:val="2"/>
-              </w:numPr>
-              <w:spacing w:after="60"/>
-            </w:pPr>
-            <w:r>
-              <w:rPr>
-                <w:color w:val="1A1A1A"/>
-              </w:rPr>
-              <w:t xml:space="preserve">Volta pra sala: bandeja circulando entre os amigos no intervalo do jogo.</w:t>
+              <w:t xml:space="preserve">Sala/varanda com o jogo passando na TV (áudio de torcida ao fundo, sem mostrar escudos de time).</w:t>
+            </w:r>
+          </w:p>
+          <w:p>
+            <w:pPr>
+              <w:pStyle w:val="ListParagraph"/>
+              <w:numPr>
+                <w:ilvl w:val="0"/>
+                <w:numId w:val="2"/>
+              </w:numPr>
+              <w:spacing w:after="60"/>
+            </w:pPr>
+            <w:r>
+              <w:rPr>
+                <w:color w:val="1A1A1A"/>
+              </w:rPr>
+              <w:t xml:space="preserve">Alguém grita da sala: "ô tchê, ainda tem pão de alho aí?" — fala natural, sem necessidade de tradução em tela.</w:t>
+            </w:r>
+          </w:p>
+          <w:p>
+            <w:pPr>
+              <w:pStyle w:val="ListParagraph"/>
+              <w:numPr>
+                <w:ilvl w:val="0"/>
+                <w:numId w:val="2"/>
+              </w:numPr>
+              <w:spacing w:after="60"/>
+            </w:pPr>
+            <w:r>
+              <w:rPr>
+                <w:color w:val="1A1A1A"/>
+              </w:rPr>
+              <w:t xml:space="preserve">Corte para a cozinha: pão de alho Santa Massa sendo fatiado, puxando queijo.</w:t>
+            </w:r>
+          </w:p>
+          <w:p>
+            <w:pPr>
+              <w:pStyle w:val="ListParagraph"/>
+              <w:numPr>
+                <w:ilvl w:val="0"/>
+                <w:numId w:val="2"/>
+              </w:numPr>
+              <w:spacing w:after="60"/>
+            </w:pPr>
+            <w:r>
+              <w:rPr>
+                <w:color w:val="1A1A1A"/>
+              </w:rPr>
+              <w:t xml:space="preserve">Bandeja circulando entre os amigos no intervalo do jogo.</w:t>
             </w:r>
           </w:p>
           <w:p>
@@ -1557,7 +1723,7 @@
               <w:rPr>
                 <w:color w:val="1A1A1A"/>
               </w:rPr>
-              <w:t xml:space="preserve">"O JOGO PARA. O PÃO DE ALHO, NÃO."</w:t>
+              <w:t xml:space="preserve">"O JOGO PARA NO INTERVALO. O PÃO DE ALHO, NÃO."</w:t>
             </w:r>
           </w:p>
           <w:p>
@@ -1572,7 +1738,7 @@
               <w:t xml:space="preserve">Texto no vídeo: </w:t>
             </w:r>
             <w:r>
-              <w:t xml:space="preserve">O JOGO PARA NO INTERVALO. O PÃO DE ALHO, NÃO.</w:t>
+              <w:t xml:space="preserve">Diálogo natural ("ô tchê, ainda tem pão de alho aí?") + lettering final: O JOGO PARA NO INTERVALO. O PÃO DE ALHO, NÃO.</w:t>
             </w:r>
           </w:p>
         </w:tc>
@@ -1646,8 +1812,8 @@
         </w:tblBorders>
       </w:tblPr>
       <w:tblGrid>
-        <w:gridCol w:w="1900"/>
-        <w:gridCol w:w="4500"/>
+        <w:gridCol w:w="2100"/>
+        <w:gridCol w:w="4300"/>
         <w:gridCol w:w="1900"/>
         <w:gridCol w:w="1940"/>
       </w:tblGrid>
@@ -1675,7 +1841,7 @@
                 <w:bCs/>
                 <w:color w:val="1A1A1A"/>
               </w:rPr>
-              <w:t xml:space="preserve">VÍDEO 4: Depois do Jogo de Bocha</w:t>
+              <w:t xml:space="preserve">VÍDEO 4: Só Pra Quem Entende</w:t>
             </w:r>
           </w:p>
         </w:tc>
@@ -1683,7 +1849,7 @@
       <w:tr>
         <w:tc>
           <w:tcPr>
-            <w:tcW w:type="dxa" w:w="1900"/>
+            <w:tcW w:type="dxa" w:w="2100"/>
             <w:tcMar>
               <w:top w:type="dxa" w:w="100"/>
               <w:left w:type="dxa" w:w="100"/>
@@ -1708,7 +1874,7 @@
         </w:tc>
         <w:tc>
           <w:tcPr>
-            <w:tcW w:type="dxa" w:w="4500"/>
+            <w:tcW w:type="dxa" w:w="4300"/>
             <w:tcMar>
               <w:top w:type="dxa" w:w="100"/>
               <w:left w:type="dxa" w:w="100"/>
@@ -1785,7 +1951,7 @@
       <w:tr>
         <w:tc>
           <w:tcPr>
-            <w:tcW w:type="dxa" w:w="1900"/>
+            <w:tcW w:type="dxa" w:w="2100"/>
             <w:tcMar>
               <w:top w:type="dxa" w:w="100"/>
               <w:left w:type="dxa" w:w="100"/>
@@ -1804,13 +1970,13 @@
                 <w:bCs/>
                 <w:color w:val="1A1A1A"/>
               </w:rPr>
-              <w:t xml:space="preserve">Farofa Santa Massa</w:t>
-            </w:r>
-          </w:p>
-        </w:tc>
-        <w:tc>
-          <w:tcPr>
-            <w:tcW w:type="dxa" w:w="4500"/>
+              <w:t xml:space="preserve">Pão de Alho Recheado Santa Massa</w:t>
+            </w:r>
+          </w:p>
+        </w:tc>
+        <w:tc>
+          <w:tcPr>
+            <w:tcW w:type="dxa" w:w="4300"/>
             <w:tcMar>
               <w:top w:type="dxa" w:w="100"/>
               <w:left w:type="dxa" w:w="100"/>
@@ -1835,7 +2001,7 @@
               <w:rPr>
                 <w:color w:val="1A1A1A"/>
               </w:rPr>
-              <w:t xml:space="preserve">Fim de tarde de bocha ou taba no quintal/CTG com amigos — todo mundo chega faminto depois da partida.</w:t>
+              <w:t xml:space="preserve">Formato de vídeo educativo/curiosidade sem uma refeição específica marcada — pensado para engajamento e alcance, mas sempre fechando no produto.</w:t>
             </w:r>
           </w:p>
           <w:p>
@@ -1854,7 +2020,7 @@
               <w:rPr>
                 <w:color w:val="1A1A1A"/>
               </w:rPr>
-              <w:t xml:space="preserve">Farofa Santa Massa sendo esquentada na frigideira, som de crocância em destaque, grãos soltos e dourados caindo no prato.</w:t>
+              <w:t xml:space="preserve">Cada resposta certa é seguida de um corte rápido no pão de alho Santa Massa sendo partido ou mordido, reforçando o apetite appeal a cada ciclo.</w:t>
             </w:r>
           </w:p>
           <w:p>
@@ -1883,55 +2049,39 @@
               <w:rPr>
                 <w:color w:val="1A1A1A"/>
               </w:rPr>
-              <w:t xml:space="preserve">Plano geral de uma partida informal de bocha no quintal (bolas rolando na grama/terra batida), risadas, disputa.</w:t>
-            </w:r>
-          </w:p>
-          <w:p>
-            <w:pPr>
-              <w:pStyle w:val="ListParagraph"/>
-              <w:numPr>
-                <w:ilvl w:val="0"/>
-                <w:numId w:val="2"/>
-              </w:numPr>
-              <w:spacing w:after="60"/>
-            </w:pPr>
-            <w:r>
-              <w:rPr>
-                <w:color w:val="1A1A1A"/>
-              </w:rPr>
-              <w:t xml:space="preserve">Corte para a cozinha: farofa Santa Massa sendo esquentada, som da crocância em primeiro plano (áudio valorizado).</w:t>
-            </w:r>
-          </w:p>
-          <w:p>
-            <w:pPr>
-              <w:pStyle w:val="ListParagraph"/>
-              <w:numPr>
-                <w:ilvl w:val="0"/>
-                <w:numId w:val="2"/>
-              </w:numPr>
-              <w:spacing w:after="60"/>
-            </w:pPr>
-            <w:r>
-              <w:rPr>
-                <w:color w:val="1A1A1A"/>
-              </w:rPr>
-              <w:t xml:space="preserve">Farofa servida numa travessa levada até o grupo, ainda no quintal.</w:t>
-            </w:r>
-          </w:p>
-          <w:p>
-            <w:pPr>
-              <w:pStyle w:val="ListParagraph"/>
-              <w:numPr>
-                <w:ilvl w:val="0"/>
-                <w:numId w:val="2"/>
-              </w:numPr>
-              <w:spacing w:after="60"/>
-            </w:pPr>
-            <w:r>
-              <w:rPr>
-                <w:color w:val="1A1A1A"/>
-              </w:rPr>
-              <w:t xml:space="preserve">Reação de satisfação de quem experimenta — um dos amigos comenta, todo mundo ri, clima leve.</w:t>
+              <w:t xml:space="preserve">Ciclo 1: aparece "CUSCO = ?" em destaque na tela, pausa de suspense, revela "CACHORRO" — corte rápido para um cachorro esperando embaixo da mesa enquanto o pão de alho é servido.</w:t>
+            </w:r>
+          </w:p>
+          <w:p>
+            <w:pPr>
+              <w:pStyle w:val="ListParagraph"/>
+              <w:numPr>
+                <w:ilvl w:val="0"/>
+                <w:numId w:val="2"/>
+              </w:numPr>
+              <w:spacing w:after="60"/>
+            </w:pPr>
+            <w:r>
+              <w:rPr>
+                <w:color w:val="1A1A1A"/>
+              </w:rPr>
+              <w:t xml:space="preserve">Ciclo 2: aparece "FIASCO = ?", revela "UMA BAITA CONFUSÃO" — corte para uma cena engraçada de disputa leve pelo último pedaço de pão de alho.</w:t>
+            </w:r>
+          </w:p>
+          <w:p>
+            <w:pPr>
+              <w:pStyle w:val="ListParagraph"/>
+              <w:numPr>
+                <w:ilvl w:val="0"/>
+                <w:numId w:val="2"/>
+              </w:numPr>
+              <w:spacing w:after="60"/>
+            </w:pPr>
+            <w:r>
+              <w:rPr>
+                <w:color w:val="1A1A1A"/>
+              </w:rPr>
+              <w:t xml:space="preserve">Ciclo 3: aparece "CHINELAGEM = ?", revela "SACANAGEM, BRINCADEIRA DE MAU GOSTO" — corte para alguém escondendo o pão de alho dos outros, de brincadeira.</w:t>
             </w:r>
           </w:p>
           <w:p>
@@ -1960,7 +2110,39 @@
               <w:rPr>
                 <w:color w:val="1A1A1A"/>
               </w:rPr>
-              <w:t xml:space="preserve">"PERDEU A PARTIDA, MAS FICOU FACEIRO NO PRATO."</w:t>
+              <w:t xml:space="preserve">"CUSCO = ?" → "CACHORRO"</w:t>
+            </w:r>
+          </w:p>
+          <w:p>
+            <w:pPr>
+              <w:pStyle w:val="ListParagraph"/>
+              <w:numPr>
+                <w:ilvl w:val="0"/>
+                <w:numId w:val="2"/>
+              </w:numPr>
+              <w:spacing w:after="60"/>
+            </w:pPr>
+            <w:r>
+              <w:rPr>
+                <w:color w:val="1A1A1A"/>
+              </w:rPr>
+              <w:t xml:space="preserve">"FIASCO = ?" → "UMA BAITA CONFUSÃO"</w:t>
+            </w:r>
+          </w:p>
+          <w:p>
+            <w:pPr>
+              <w:pStyle w:val="ListParagraph"/>
+              <w:numPr>
+                <w:ilvl w:val="0"/>
+                <w:numId w:val="2"/>
+              </w:numPr>
+              <w:spacing w:after="60"/>
+            </w:pPr>
+            <w:r>
+              <w:rPr>
+                <w:color w:val="1A1A1A"/>
+              </w:rPr>
+              <w:t xml:space="preserve">"CHINELAGEM = ?" → "SACANAGEM, BRINCADEIRA DE MAU GOSTO"</w:t>
             </w:r>
           </w:p>
           <w:p>
@@ -1975,7 +2157,7 @@
               <w:t xml:space="preserve">Texto no vídeo: </w:t>
             </w:r>
             <w:r>
-              <w:t xml:space="preserve">PERDEU A PARTIDA, MAS FICOU FACEIRO NO PRATO.</w:t>
+              <w:t xml:space="preserve">sequência "PALAVRA = ?" seguida da resposta em cada ciclo (ver lettering)</w:t>
             </w:r>
           </w:p>
         </w:tc>
@@ -2000,7 +2182,7 @@
                 <w:iCs/>
                 <w:color w:val="555555"/>
               </w:rPr>
-              <w:t xml:space="preserve">Buscar referência: Reels de jogos de quintal entre amigos (bocha, taba, buraco) seguidos de comida — bom gancho de comunidade/lazer.</w:t>
+              <w:t xml:space="preserve">Buscar referência: formato pergunta-e-resposta de gírias regionais, câmera selfie com corte seco.</w:t>
             </w:r>
           </w:p>
         </w:tc>
@@ -2025,7 +2207,7 @@
                 <w:iCs/>
                 <w:color w:val="555555"/>
               </w:rPr>
-              <w:t xml:space="preserve">Áudio em destaque no momento da farofa crocante (ASMR leve), contraste entre o esforço físico do jogo e o descanso da comida.</w:t>
+              <w:t xml:space="preserve">Texto grande centralizado tipo meme sobre fundo neutro, alternância rápida entre a pergunta e a cena do produto.</w:t>
             </w:r>
           </w:p>
         </w:tc>
@@ -2049,8 +2231,8 @@
         </w:tblBorders>
       </w:tblPr>
       <w:tblGrid>
-        <w:gridCol w:w="1900"/>
-        <w:gridCol w:w="4500"/>
+        <w:gridCol w:w="2100"/>
+        <w:gridCol w:w="4300"/>
         <w:gridCol w:w="1900"/>
         <w:gridCol w:w="1940"/>
       </w:tblGrid>
@@ -2078,7 +2260,7 @@
                 <w:bCs/>
                 <w:color w:val="1A1A1A"/>
               </w:rPr>
-              <w:t xml:space="preserve">VÍDEO 5: Vale Cada Pila</w:t>
+              <w:t xml:space="preserve">VÍDEO 5: Depois do Jogo de Bocha</w:t>
             </w:r>
           </w:p>
         </w:tc>
@@ -2086,7 +2268,7 @@
       <w:tr>
         <w:tc>
           <w:tcPr>
-            <w:tcW w:type="dxa" w:w="1900"/>
+            <w:tcW w:type="dxa" w:w="2100"/>
             <w:tcMar>
               <w:top w:type="dxa" w:w="100"/>
               <w:left w:type="dxa" w:w="100"/>
@@ -2111,7 +2293,7 @@
         </w:tc>
         <w:tc>
           <w:tcPr>
-            <w:tcW w:type="dxa" w:w="4500"/>
+            <w:tcW w:type="dxa" w:w="4300"/>
             <w:tcMar>
               <w:top w:type="dxa" w:w="100"/>
               <w:left w:type="dxa" w:w="100"/>
@@ -2188,7 +2370,7 @@
       <w:tr>
         <w:tc>
           <w:tcPr>
-            <w:tcW w:type="dxa" w:w="1900"/>
+            <w:tcW w:type="dxa" w:w="2100"/>
             <w:tcMar>
               <w:top w:type="dxa" w:w="100"/>
               <w:left w:type="dxa" w:w="100"/>
@@ -2220,13 +2402,13 @@
                 <w:bCs/>
                 <w:color w:val="1A1A1A"/>
               </w:rPr>
-              <w:t xml:space="preserve">Farofa Santa Massa</w:t>
-            </w:r>
-          </w:p>
-        </w:tc>
-        <w:tc>
-          <w:tcPr>
-            <w:tcW w:type="dxa" w:w="4500"/>
+              <w:t xml:space="preserve">Farofa Santa Massa (usada como tempero/acompanhamento polvilhado sobre a carne — não é um prato à parte)</w:t>
+            </w:r>
+          </w:p>
+        </w:tc>
+        <w:tc>
+          <w:tcPr>
+            <w:tcW w:type="dxa" w:w="4300"/>
             <w:tcMar>
               <w:top w:type="dxa" w:w="100"/>
               <w:left w:type="dxa" w:w="100"/>
@@ -2251,7 +2433,7 @@
               <w:rPr>
                 <w:color w:val="1A1A1A"/>
               </w:rPr>
-              <w:t xml:space="preserve">Sexta à noite, happy hour em casa — mesa de petiscos simples entre amigos antes de sair ou pra ficar mesmo.</w:t>
+              <w:t xml:space="preserve">Fim de tarde de bocha no quintal/CTG com amigos — todo mundo chega faminto depois da partida, e a churrasqueira já tá pronta.</w:t>
             </w:r>
           </w:p>
           <w:p>
@@ -2270,7 +2452,7 @@
               <w:rPr>
                 <w:color w:val="1A1A1A"/>
               </w:rPr>
-              <w:t xml:space="preserve">Mesa de petiscos completa, luz quente (tipo boteco), still com o pão de alho já pela metade e a farofa numa tigela pequena ao lado das bebidas.</w:t>
+              <w:t xml:space="preserve">Pão de alho Santa Massa sendo fatiado à mesa; farofa sendo polvilhada por cima da carne recém-cortada como toque final, nunca sozinha no prato.</w:t>
             </w:r>
           </w:p>
           <w:p>
@@ -2299,39 +2481,55 @@
               <w:rPr>
                 <w:color w:val="1A1A1A"/>
               </w:rPr>
-              <w:t xml:space="preserve">Mesa de sexta à noite sendo montada: petiscos variados, e o pão de alho e a farofa Santa Massa ganhando destaque entre eles.</w:t>
-            </w:r>
-          </w:p>
-          <w:p>
-            <w:pPr>
-              <w:pStyle w:val="ListParagraph"/>
-              <w:numPr>
-                <w:ilvl w:val="0"/>
-                <w:numId w:val="2"/>
-              </w:numPr>
-              <w:spacing w:after="60"/>
-            </w:pPr>
-            <w:r>
-              <w:rPr>
-                <w:color w:val="1A1A1A"/>
-              </w:rPr>
-              <w:t xml:space="preserve">Alguém serve um pedaço do pão de alho pro amigo, reação de aprovação imediata.</w:t>
-            </w:r>
-          </w:p>
-          <w:p>
-            <w:pPr>
-              <w:pStyle w:val="ListParagraph"/>
-              <w:numPr>
-                <w:ilvl w:val="0"/>
-                <w:numId w:val="2"/>
-              </w:numPr>
-              <w:spacing w:after="60"/>
-            </w:pPr>
-            <w:r>
-              <w:rPr>
-                <w:color w:val="1A1A1A"/>
-              </w:rPr>
-              <w:t xml:space="preserve">Still da embalagem ao lado do prato quase vazio, sugerindo que "sumiu rápido".</w:t>
+              <w:t xml:space="preserve">Plano geral de uma partida informal de bocha no quintal, risadas, disputa leve.</w:t>
+            </w:r>
+          </w:p>
+          <w:p>
+            <w:pPr>
+              <w:pStyle w:val="ListParagraph"/>
+              <w:numPr>
+                <w:ilvl w:val="0"/>
+                <w:numId w:val="2"/>
+              </w:numPr>
+              <w:spacing w:after="60"/>
+            </w:pPr>
+            <w:r>
+              <w:rPr>
+                <w:color w:val="1A1A1A"/>
+              </w:rPr>
+              <w:t xml:space="preserve">Um brigadiano (policial) passando na rua desacelera o passo, sentindo o cheiro do churrasco vindo do quintal — só a reação, sem diálogo, como piscadela para quem entende o termo.</w:t>
+            </w:r>
+          </w:p>
+          <w:p>
+            <w:pPr>
+              <w:pStyle w:val="ListParagraph"/>
+              <w:numPr>
+                <w:ilvl w:val="0"/>
+                <w:numId w:val="2"/>
+              </w:numPr>
+              <w:spacing w:after="60"/>
+            </w:pPr>
+            <w:r>
+              <w:rPr>
+                <w:color w:val="1A1A1A"/>
+              </w:rPr>
+              <w:t xml:space="preserve">Corte para a mesa: carne sendo fatiada, farofa Santa Massa sendo polvilhada por cima como tempero final.</w:t>
+            </w:r>
+          </w:p>
+          <w:p>
+            <w:pPr>
+              <w:pStyle w:val="ListParagraph"/>
+              <w:numPr>
+                <w:ilvl w:val="0"/>
+                <w:numId w:val="2"/>
+              </w:numPr>
+              <w:spacing w:after="60"/>
+            </w:pPr>
+            <w:r>
+              <w:rPr>
+                <w:color w:val="1A1A1A"/>
+              </w:rPr>
+              <w:t xml:space="preserve">Pão de alho Santa Massa servido ao lado — a peça que todo mundo pega primeiro.</w:t>
             </w:r>
           </w:p>
           <w:p>
@@ -2360,7 +2558,7 @@
               <w:rPr>
                 <w:color w:val="1A1A1A"/>
               </w:rPr>
-              <w:t xml:space="preserve">"CUSTA UMA PILA E VALE UM RIO GRANDE."</w:t>
+              <w:t xml:space="preserve">"NEM O BRIGADIANO RESISTE AO CHEIRO."</w:t>
             </w:r>
           </w:p>
           <w:p>
@@ -2375,7 +2573,7 @@
               <w:t xml:space="preserve">Texto no vídeo: </w:t>
             </w:r>
             <w:r>
-              <w:t xml:space="preserve">CUSTA UMA PILA E VALE UM RIO GRANDE.</w:t>
+              <w:t xml:space="preserve">NEM O BRIGADIANO RESISTE AO CHEIRO.</w:t>
             </w:r>
           </w:p>
         </w:tc>
@@ -2400,7 +2598,7 @@
                 <w:iCs/>
                 <w:color w:val="555555"/>
               </w:rPr>
-              <w:t xml:space="preserve">Buscar referência: Reels de mesa de happy hour em casa entre amigos, plano aberto da mesa + closes individuais dos petiscos.</w:t>
+              <w:t xml:space="preserve">Buscar referência: Reels de jogos de quintal entre amigos (bocha, taba, buraco) seguidos de churrasco — bom gancho de comunidade/lazer.</w:t>
             </w:r>
           </w:p>
         </w:tc>
@@ -2425,7 +2623,7 @@
                 <w:iCs/>
                 <w:color w:val="555555"/>
               </w:rPr>
-              <w:t xml:space="preserve">Luz quente estilo boteco, prato central sendo esvaziado ao longo do vídeo para reforçar que "sumiu rápido".</w:t>
+              <w:t xml:space="preserve">Contraste entre o esforço físico do jogo e o momento de fartura à mesa; farofa mostrada apenas como toque final sobre a carne.</w:t>
             </w:r>
           </w:p>
         </w:tc>
@@ -2449,8 +2647,8 @@
         </w:tblBorders>
       </w:tblPr>
       <w:tblGrid>
-        <w:gridCol w:w="1900"/>
-        <w:gridCol w:w="4500"/>
+        <w:gridCol w:w="2100"/>
+        <w:gridCol w:w="4300"/>
         <w:gridCol w:w="1900"/>
         <w:gridCol w:w="1940"/>
       </w:tblGrid>
@@ -2478,7 +2676,7 @@
                 <w:bCs/>
                 <w:color w:val="1A1A1A"/>
               </w:rPr>
-              <w:t xml:space="preserve">VÍDEO 6: Aquele Frio de Julho</w:t>
+              <w:t xml:space="preserve">VÍDEO 6: Vale Cada Pila</w:t>
             </w:r>
           </w:p>
         </w:tc>
@@ -2486,7 +2684,7 @@
       <w:tr>
         <w:tc>
           <w:tcPr>
-            <w:tcW w:type="dxa" w:w="1900"/>
+            <w:tcW w:type="dxa" w:w="2100"/>
             <w:tcMar>
               <w:top w:type="dxa" w:w="100"/>
               <w:left w:type="dxa" w:w="100"/>
@@ -2511,7 +2709,7 @@
         </w:tc>
         <w:tc>
           <w:tcPr>
-            <w:tcW w:type="dxa" w:w="4500"/>
+            <w:tcW w:type="dxa" w:w="4300"/>
             <w:tcMar>
               <w:top w:type="dxa" w:w="100"/>
               <w:left w:type="dxa" w:w="100"/>
@@ -2588,7 +2786,7 @@
       <w:tr>
         <w:tc>
           <w:tcPr>
-            <w:tcW w:type="dxa" w:w="1900"/>
+            <w:tcW w:type="dxa" w:w="2100"/>
             <w:tcMar>
               <w:top w:type="dxa" w:w="100"/>
               <w:left w:type="dxa" w:w="100"/>
@@ -2613,7 +2811,7 @@
         </w:tc>
         <w:tc>
           <w:tcPr>
-            <w:tcW w:type="dxa" w:w="4500"/>
+            <w:tcW w:type="dxa" w:w="4300"/>
             <w:tcMar>
               <w:top w:type="dxa" w:w="100"/>
               <w:left w:type="dxa" w:w="100"/>
@@ -2638,7 +2836,7 @@
               <w:rPr>
                 <w:color w:val="1A1A1A"/>
               </w:rPr>
-              <w:t xml:space="preserve">Noite fria de inverno gaúcho — o momento de chegar em casa com frio e quere algo quente na hora.</w:t>
+              <w:t xml:space="preserve">Sexta à noite, happy hour em casa — mesa de petiscos simples entre amigos antes de sair ou pra ficar mesmo.</w:t>
             </w:r>
           </w:p>
           <w:p>
@@ -2657,7 +2855,7 @@
               <w:rPr>
                 <w:color w:val="1A1A1A"/>
               </w:rPr>
-              <w:t xml:space="preserve">Contraste entre o frio (respiração visível, mãos frias) e o vapor forte saindo do pão de alho recém-pronto; queijo esticando bem devagar.</w:t>
+              <w:t xml:space="preserve">Pão de alho já pela metade, queijo ainda brilhando na luz quente da mesa de petiscos.</w:t>
             </w:r>
           </w:p>
           <w:p>
@@ -2686,39 +2884,39 @@
               <w:rPr>
                 <w:color w:val="1A1A1A"/>
               </w:rPr>
-              <w:t xml:space="preserve">Alguém chegando em casa à noite, se esfregando pra esquentar as mãos, típico frio gaúcho de julho.</w:t>
-            </w:r>
-          </w:p>
-          <w:p>
-            <w:pPr>
-              <w:pStyle w:val="ListParagraph"/>
-              <w:numPr>
-                <w:ilvl w:val="0"/>
-                <w:numId w:val="2"/>
-              </w:numPr>
-              <w:spacing w:after="60"/>
-            </w:pPr>
-            <w:r>
-              <w:rPr>
-                <w:color w:val="1A1A1A"/>
-              </w:rPr>
-              <w:t xml:space="preserve">Corte para o pão de alho Santa Massa saindo do forno/grelha, vapor bem visível no ar frio.</w:t>
-            </w:r>
-          </w:p>
-          <w:p>
-            <w:pPr>
-              <w:pStyle w:val="ListParagraph"/>
-              <w:numPr>
-                <w:ilvl w:val="0"/>
-                <w:numId w:val="2"/>
-              </w:numPr>
-              <w:spacing w:after="60"/>
-            </w:pPr>
-            <w:r>
-              <w:rPr>
-                <w:color w:val="1A1A1A"/>
-              </w:rPr>
-              <w:t xml:space="preserve">Primeira mordida, expressão de alívio/conforto.</w:t>
+              <w:t xml:space="preserve">Mesa de sexta à noite sendo montada: petiscos variados, e o pão de alho Santa Massa ganhando destaque entre eles.</w:t>
+            </w:r>
+          </w:p>
+          <w:p>
+            <w:pPr>
+              <w:pStyle w:val="ListParagraph"/>
+              <w:numPr>
+                <w:ilvl w:val="0"/>
+                <w:numId w:val="2"/>
+              </w:numPr>
+              <w:spacing w:after="60"/>
+            </w:pPr>
+            <w:r>
+              <w:rPr>
+                <w:color w:val="1A1A1A"/>
+              </w:rPr>
+              <w:t xml:space="preserve">Alguém serve um pedaço para o amigo, reação de aprovação imediata.</w:t>
+            </w:r>
+          </w:p>
+          <w:p>
+            <w:pPr>
+              <w:pStyle w:val="ListParagraph"/>
+              <w:numPr>
+                <w:ilvl w:val="0"/>
+                <w:numId w:val="2"/>
+              </w:numPr>
+              <w:spacing w:after="60"/>
+            </w:pPr>
+            <w:r>
+              <w:rPr>
+                <w:color w:val="1A1A1A"/>
+              </w:rPr>
+              <w:t xml:space="preserve">Still da embalagem ao lado do prato quase vazio, sugerindo que "sumiu rápido".</w:t>
             </w:r>
           </w:p>
           <w:p>
@@ -2747,7 +2945,7 @@
               <w:rPr>
                 <w:color w:val="1A1A1A"/>
               </w:rPr>
-              <w:t xml:space="preserve">"O FRIO NÃO PERDOA. O PÃO DE ALHO, TAMBÉM NÃO."</w:t>
+              <w:t xml:space="preserve">"CUSTA UMA PILA E VALE UM RIO GRANDE."</w:t>
             </w:r>
           </w:p>
           <w:p>
@@ -2762,7 +2960,7 @@
               <w:t xml:space="preserve">Texto no vídeo: </w:t>
             </w:r>
             <w:r>
-              <w:t xml:space="preserve">O FRIO NÃO PERDOA. O PÃO DE ALHO, TAMBÉM NÃO.</w:t>
+              <w:t xml:space="preserve">CUSTA UMA PILA E VALE UM RIO GRANDE.</w:t>
             </w:r>
           </w:p>
         </w:tc>
@@ -2787,7 +2985,7 @@
                 <w:iCs/>
                 <w:color w:val="555555"/>
               </w:rPr>
-              <w:t xml:space="preserve">Buscar referência: Reels de "comida quente em dia frio" — contraste de temperatura como gancho visual.</w:t>
+              <w:t xml:space="preserve">Buscar referência: Reels de mesa de happy hour em casa entre amigos, plano aberto da mesa + closes individuais dos petiscos.</w:t>
             </w:r>
           </w:p>
         </w:tc>
@@ -2812,7 +3010,7 @@
                 <w:iCs/>
                 <w:color w:val="555555"/>
               </w:rPr>
-              <w:t xml:space="preserve">Vapor do produto contra o ambiente frio (respiração visível de propósito), luz mais azulada fora e quente dentro de casa.</w:t>
+              <w:t xml:space="preserve">Luz quente estilo boteco, prato central sendo esvaziado ao longo do vídeo para reforçar que "sumiu rápido".</w:t>
             </w:r>
           </w:p>
         </w:tc>
@@ -2836,8 +3034,8 @@
         </w:tblBorders>
       </w:tblPr>
       <w:tblGrid>
-        <w:gridCol w:w="1900"/>
-        <w:gridCol w:w="4500"/>
+        <w:gridCol w:w="2100"/>
+        <w:gridCol w:w="4300"/>
         <w:gridCol w:w="1900"/>
         <w:gridCol w:w="1940"/>
       </w:tblGrid>
@@ -2865,7 +3063,7 @@
                 <w:bCs/>
                 <w:color w:val="1A1A1A"/>
               </w:rPr>
-              <w:t xml:space="preserve">VÍDEO 7: Depois da Lida no Quintal</w:t>
+              <w:t xml:space="preserve">VÍDEO 7: Aquele Frio de Julho</w:t>
             </w:r>
           </w:p>
         </w:tc>
@@ -2873,7 +3071,7 @@
       <w:tr>
         <w:tc>
           <w:tcPr>
-            <w:tcW w:type="dxa" w:w="1900"/>
+            <w:tcW w:type="dxa" w:w="2100"/>
             <w:tcMar>
               <w:top w:type="dxa" w:w="100"/>
               <w:left w:type="dxa" w:w="100"/>
@@ -2898,7 +3096,7 @@
         </w:tc>
         <w:tc>
           <w:tcPr>
-            <w:tcW w:type="dxa" w:w="4500"/>
+            <w:tcW w:type="dxa" w:w="4300"/>
             <w:tcMar>
               <w:top w:type="dxa" w:w="100"/>
               <w:left w:type="dxa" w:w="100"/>
@@ -2975,6 +3173,218 @@
       <w:tr>
         <w:tc>
           <w:tcPr>
+            <w:tcW w:type="dxa" w:w="2100"/>
+            <w:tcMar>
+              <w:top w:type="dxa" w:w="100"/>
+              <w:left w:type="dxa" w:w="100"/>
+              <w:bottom w:type="dxa" w:w="100"/>
+              <w:right w:type="dxa" w:w="100"/>
+            </w:tcMar>
+            <w:vAlign w:val="top"/>
+          </w:tcPr>
+          <w:p>
+            <w:pPr>
+              <w:spacing w:after="0"/>
+            </w:pPr>
+            <w:r>
+              <w:rPr>
+                <w:b/>
+                <w:bCs/>
+                <w:color w:val="1A1A1A"/>
+              </w:rPr>
+              <w:t xml:space="preserve">Pão de Alho Recheado Santa Massa</w:t>
+            </w:r>
+          </w:p>
+        </w:tc>
+        <w:tc>
+          <w:tcPr>
+            <w:tcW w:type="dxa" w:w="4300"/>
+            <w:tcMar>
+              <w:top w:type="dxa" w:w="100"/>
+              <w:left w:type="dxa" w:w="100"/>
+              <w:bottom w:type="dxa" w:w="100"/>
+              <w:right w:type="dxa" w:w="100"/>
+            </w:tcMar>
+            <w:vAlign w:val="top"/>
+          </w:tcPr>
+          <w:p>
+            <w:pPr>
+              <w:spacing w:after="80" w:before="0"/>
+            </w:pPr>
+            <w:r>
+              <w:rPr>
+                <w:b/>
+                <w:bCs/>
+                <w:color w:val="1A1A1A"/>
+              </w:rPr>
+              <w:t xml:space="preserve">Ocasião de consumo: </w:t>
+            </w:r>
+            <w:r>
+              <w:rPr>
+                <w:color w:val="1A1A1A"/>
+              </w:rPr>
+              <w:t xml:space="preserve">Noite fria de inverno gaúcho — o momento de chegar em casa com frio e querer algo quente na hora.</w:t>
+            </w:r>
+          </w:p>
+          <w:p>
+            <w:pPr>
+              <w:spacing w:after="80" w:before="0"/>
+            </w:pPr>
+            <w:r>
+              <w:rPr>
+                <w:b/>
+                <w:bCs/>
+                <w:color w:val="1A1A1A"/>
+              </w:rPr>
+              <w:t xml:space="preserve">Apetite appeal: </w:t>
+            </w:r>
+            <w:r>
+              <w:rPr>
+                <w:color w:val="1A1A1A"/>
+              </w:rPr>
+              <w:t xml:space="preserve">Contraste entre o frio (respiração visível, mãos frias) e o vapor forte saindo do pão de alho recém-pronto; queijo esticando bem devagar.</w:t>
+            </w:r>
+          </w:p>
+          <w:p>
+            <w:pPr>
+              <w:spacing w:after="80"/>
+            </w:pPr>
+            <w:r>
+              <w:rPr>
+                <w:b/>
+                <w:bCs/>
+                <w:color w:val="1A1A1A"/>
+              </w:rPr>
+              <w:t xml:space="preserve">Cena a cena:</w:t>
+            </w:r>
+          </w:p>
+          <w:p>
+            <w:pPr>
+              <w:pStyle w:val="ListParagraph"/>
+              <w:numPr>
+                <w:ilvl w:val="0"/>
+                <w:numId w:val="2"/>
+              </w:numPr>
+              <w:spacing w:after="60"/>
+            </w:pPr>
+            <w:r>
+              <w:rPr>
+                <w:color w:val="1A1A1A"/>
+              </w:rPr>
+              <w:t xml:space="preserve">Alguém chegando em casa à noite, esfregando as mãos pra esquentar, típico frio gaúcho de julho.</w:t>
+            </w:r>
+          </w:p>
+          <w:p>
+            <w:pPr>
+              <w:pStyle w:val="ListParagraph"/>
+              <w:numPr>
+                <w:ilvl w:val="0"/>
+                <w:numId w:val="2"/>
+              </w:numPr>
+              <w:spacing w:after="60"/>
+            </w:pPr>
+            <w:r>
+              <w:rPr>
+                <w:color w:val="1A1A1A"/>
+              </w:rPr>
+              <w:t xml:space="preserve">Cozinha um pouco bagunçada de tanto se apressar para preparar o jantar — "ficou meio esculhambada, mas valeu a pena".</w:t>
+            </w:r>
+          </w:p>
+          <w:p>
+            <w:pPr>
+              <w:pStyle w:val="ListParagraph"/>
+              <w:numPr>
+                <w:ilvl w:val="0"/>
+                <w:numId w:val="2"/>
+              </w:numPr>
+              <w:spacing w:after="60"/>
+            </w:pPr>
+            <w:r>
+              <w:rPr>
+                <w:color w:val="1A1A1A"/>
+              </w:rPr>
+              <w:t xml:space="preserve">Corte para o pão de alho Santa Massa saindo do forno/grelha, vapor bem visível no ar frio.</w:t>
+            </w:r>
+          </w:p>
+          <w:p>
+            <w:pPr>
+              <w:pStyle w:val="ListParagraph"/>
+              <w:numPr>
+                <w:ilvl w:val="0"/>
+                <w:numId w:val="2"/>
+              </w:numPr>
+              <w:spacing w:after="60"/>
+            </w:pPr>
+            <w:r>
+              <w:rPr>
+                <w:color w:val="1A1A1A"/>
+              </w:rPr>
+              <w:t xml:space="preserve">Primeira mordida, expressão de alívio/conforto.</w:t>
+            </w:r>
+          </w:p>
+          <w:p>
+            <w:pPr>
+              <w:spacing w:after="80"/>
+            </w:pPr>
+            <w:r>
+              <w:rPr>
+                <w:b/>
+                <w:bCs/>
+                <w:color w:val="1A1A1A"/>
+              </w:rPr>
+              <w:t xml:space="preserve">Lettering:</w:t>
+            </w:r>
+          </w:p>
+          <w:p>
+            <w:pPr>
+              <w:pStyle w:val="ListParagraph"/>
+              <w:numPr>
+                <w:ilvl w:val="0"/>
+                <w:numId w:val="2"/>
+              </w:numPr>
+              <w:spacing w:after="60"/>
+            </w:pPr>
+            <w:r>
+              <w:rPr>
+                <w:color w:val="1A1A1A"/>
+              </w:rPr>
+              <w:t xml:space="preserve">"A COZINHA FICOU ESCULHAMBADA."</w:t>
+            </w:r>
+          </w:p>
+          <w:p>
+            <w:pPr>
+              <w:pStyle w:val="ListParagraph"/>
+              <w:numPr>
+                <w:ilvl w:val="0"/>
+                <w:numId w:val="2"/>
+              </w:numPr>
+              <w:spacing w:after="60"/>
+            </w:pPr>
+            <w:r>
+              <w:rPr>
+                <w:color w:val="1A1A1A"/>
+              </w:rPr>
+              <w:t xml:space="preserve">"O PÃO DE ALHO SAIU PERFEITO."</w:t>
+            </w:r>
+          </w:p>
+          <w:p>
+            <w:pPr>
+              <w:spacing w:before="60"/>
+            </w:pPr>
+            <w:r>
+              <w:rPr>
+                <w:b/>
+                <w:bCs/>
+              </w:rPr>
+              <w:t xml:space="preserve">Texto no vídeo: </w:t>
+            </w:r>
+            <w:r>
+              <w:t xml:space="preserve">A COZINHA FICOU ESCULHAMBADA. O PÃO DE ALHO SAIU PERFEITO.</w:t>
+            </w:r>
+          </w:p>
+        </w:tc>
+        <w:tc>
+          <w:tcPr>
             <w:tcW w:type="dxa" w:w="1900"/>
             <w:tcMar>
               <w:top w:type="dxa" w:w="100"/>
@@ -2986,15 +3396,222 @@
           </w:tcPr>
           <w:p>
             <w:pPr>
-              <w:spacing w:after="60"/>
-            </w:pPr>
-            <w:r>
-              <w:rPr>
-                <w:b/>
-                <w:bCs/>
-                <w:color w:val="1A1A1A"/>
-              </w:rPr>
-              <w:t xml:space="preserve">Farofa Santa Massa</w:t>
+              <w:spacing w:after="80"/>
+            </w:pPr>
+            <w:r>
+              <w:rPr>
+                <w:i/>
+                <w:iCs/>
+                <w:color w:val="555555"/>
+              </w:rPr>
+              <w:t xml:space="preserve">Buscar referência: Reels de "comida quente em dia frio" — contraste de temperatura como gancho visual.</w:t>
+            </w:r>
+          </w:p>
+        </w:tc>
+        <w:tc>
+          <w:tcPr>
+            <w:tcW w:type="dxa" w:w="1940"/>
+            <w:tcMar>
+              <w:top w:type="dxa" w:w="100"/>
+              <w:left w:type="dxa" w:w="100"/>
+              <w:bottom w:type="dxa" w:w="100"/>
+              <w:right w:type="dxa" w:w="100"/>
+            </w:tcMar>
+            <w:vAlign w:val="top"/>
+          </w:tcPr>
+          <w:p>
+            <w:pPr>
+              <w:spacing w:after="80"/>
+            </w:pPr>
+            <w:r>
+              <w:rPr>
+                <w:i/>
+                <w:iCs/>
+                <w:color w:val="555555"/>
+              </w:rPr>
+              <w:t xml:space="preserve">Vapor do produto contra o ambiente frio (respiração visível de propósito), luz mais azulada fora e quente dentro de casa.</w:t>
+            </w:r>
+          </w:p>
+        </w:tc>
+      </w:tr>
+    </w:tbl>
+    <w:p>
+      <w:pPr>
+        <w:spacing w:after="200"/>
+      </w:pPr>
+    </w:p>
+    <w:tbl>
+      <w:tblPr>
+        <w:tblW w:type="dxa" w:w="10240"/>
+        <w:tblBorders>
+          <w:top w:val="single" w:color="auto" w:sz="4"/>
+          <w:left w:val="single" w:color="auto" w:sz="4"/>
+          <w:bottom w:val="single" w:color="auto" w:sz="4"/>
+          <w:right w:val="single" w:color="auto" w:sz="4"/>
+          <w:insideH w:val="single" w:color="auto" w:sz="4"/>
+          <w:insideV w:val="single" w:color="auto" w:sz="4"/>
+        </w:tblBorders>
+      </w:tblPr>
+      <w:tblGrid>
+        <w:gridCol w:w="2100"/>
+        <w:gridCol w:w="4300"/>
+        <w:gridCol w:w="1900"/>
+        <w:gridCol w:w="1940"/>
+      </w:tblGrid>
+      <w:tr>
+        <w:tc>
+          <w:tcPr>
+            <w:tcW w:type="dxa" w:w="10240"/>
+            <w:gridSpan w:val="4"/>
+            <w:shd w:fill="BFBFBF" w:val="clear"/>
+            <w:tcMar>
+              <w:top w:type="dxa" w:w="100"/>
+              <w:left w:type="dxa" w:w="100"/>
+              <w:bottom w:type="dxa" w:w="100"/>
+              <w:right w:type="dxa" w:w="100"/>
+            </w:tcMar>
+            <w:vAlign w:val="top"/>
+          </w:tcPr>
+          <w:p>
+            <w:pPr>
+              <w:spacing w:after="80"/>
+            </w:pPr>
+            <w:r>
+              <w:rPr>
+                <w:b/>
+                <w:bCs/>
+                <w:color w:val="1A1A1A"/>
+              </w:rPr>
+              <w:t xml:space="preserve">VÍDEO 8: Depois da Lida no Quintal</w:t>
+            </w:r>
+          </w:p>
+        </w:tc>
+      </w:tr>
+      <w:tr>
+        <w:tc>
+          <w:tcPr>
+            <w:tcW w:type="dxa" w:w="2100"/>
+            <w:tcMar>
+              <w:top w:type="dxa" w:w="100"/>
+              <w:left w:type="dxa" w:w="100"/>
+              <w:bottom w:type="dxa" w:w="100"/>
+              <w:right w:type="dxa" w:w="100"/>
+            </w:tcMar>
+            <w:vAlign w:val="top"/>
+          </w:tcPr>
+          <w:p>
+            <w:pPr>
+              <w:spacing w:after="80"/>
+            </w:pPr>
+            <w:r>
+              <w:rPr>
+                <w:b/>
+                <w:bCs/>
+                <w:color w:val="1A1A1A"/>
+              </w:rPr>
+              <w:t xml:space="preserve">PRODUTO</w:t>
+            </w:r>
+          </w:p>
+        </w:tc>
+        <w:tc>
+          <w:tcPr>
+            <w:tcW w:type="dxa" w:w="4300"/>
+            <w:tcMar>
+              <w:top w:type="dxa" w:w="100"/>
+              <w:left w:type="dxa" w:w="100"/>
+              <w:bottom w:type="dxa" w:w="100"/>
+              <w:right w:type="dxa" w:w="100"/>
+            </w:tcMar>
+            <w:vAlign w:val="top"/>
+          </w:tcPr>
+          <w:p>
+            <w:pPr>
+              <w:spacing w:after="80"/>
+            </w:pPr>
+            <w:r>
+              <w:rPr>
+                <w:b/>
+                <w:bCs/>
+                <w:color w:val="1A1A1A"/>
+              </w:rPr>
+              <w:t xml:space="preserve">ROTEIRO</w:t>
+            </w:r>
+          </w:p>
+        </w:tc>
+        <w:tc>
+          <w:tcPr>
+            <w:tcW w:type="dxa" w:w="1900"/>
+            <w:tcMar>
+              <w:top w:type="dxa" w:w="100"/>
+              <w:left w:type="dxa" w:w="100"/>
+              <w:bottom w:type="dxa" w:w="100"/>
+              <w:right w:type="dxa" w:w="100"/>
+            </w:tcMar>
+            <w:vAlign w:val="top"/>
+          </w:tcPr>
+          <w:p>
+            <w:pPr>
+              <w:spacing w:after="80"/>
+            </w:pPr>
+            <w:r>
+              <w:rPr>
+                <w:b/>
+                <w:bCs/>
+                <w:color w:val="1A1A1A"/>
+              </w:rPr>
+              <w:t xml:space="preserve">REF</w:t>
+            </w:r>
+          </w:p>
+        </w:tc>
+        <w:tc>
+          <w:tcPr>
+            <w:tcW w:type="dxa" w:w="1940"/>
+            <w:tcMar>
+              <w:top w:type="dxa" w:w="100"/>
+              <w:left w:type="dxa" w:w="100"/>
+              <w:bottom w:type="dxa" w:w="100"/>
+              <w:right w:type="dxa" w:w="100"/>
+            </w:tcMar>
+            <w:vAlign w:val="top"/>
+          </w:tcPr>
+          <w:p>
+            <w:pPr>
+              <w:spacing w:after="80"/>
+            </w:pPr>
+            <w:r>
+              <w:rPr>
+                <w:b/>
+                <w:bCs/>
+                <w:color w:val="1A1A1A"/>
+              </w:rPr>
+              <w:t xml:space="preserve">INSPIRAÇÃO</w:t>
+            </w:r>
+          </w:p>
+        </w:tc>
+      </w:tr>
+      <w:tr>
+        <w:tc>
+          <w:tcPr>
+            <w:tcW w:type="dxa" w:w="2100"/>
+            <w:tcMar>
+              <w:top w:type="dxa" w:w="100"/>
+              <w:left w:type="dxa" w:w="100"/>
+              <w:bottom w:type="dxa" w:w="100"/>
+              <w:right w:type="dxa" w:w="100"/>
+            </w:tcMar>
+            <w:vAlign w:val="top"/>
+          </w:tcPr>
+          <w:p>
+            <w:pPr>
+              <w:spacing w:after="60"/>
+            </w:pPr>
+            <w:r>
+              <w:rPr>
+                <w:b/>
+                <w:bCs/>
+                <w:color w:val="1A1A1A"/>
+              </w:rPr>
+              <w:t xml:space="preserve">Pão de Alho Recheado Santa Massa</w:t>
             </w:r>
           </w:p>
           <w:p>
@@ -3007,13 +3624,13 @@
                 <w:bCs/>
                 <w:color w:val="1A1A1A"/>
               </w:rPr>
-              <w:t xml:space="preserve">Pão de Alho Recheado Santa Massa</w:t>
-            </w:r>
-          </w:p>
-        </w:tc>
-        <w:tc>
-          <w:tcPr>
-            <w:tcW w:type="dxa" w:w="4500"/>
+              <w:t xml:space="preserve">Farofa Santa Massa (usada como tempero/acompanhamento polvilhado sobre a carne — não é um prato à parte)</w:t>
+            </w:r>
+          </w:p>
+        </w:tc>
+        <w:tc>
+          <w:tcPr>
+            <w:tcW w:type="dxa" w:w="4300"/>
             <w:tcMar>
               <w:top w:type="dxa" w:w="100"/>
               <w:left w:type="dxa" w:w="100"/>
@@ -3057,7 +3674,7 @@
               <w:rPr>
                 <w:color w:val="1A1A1A"/>
               </w:rPr>
-              <w:t xml:space="preserve">Prato fumegante esperando na mesa, garfada satisfeita, corte mostrando fartura (carne, farofa crocante e pão de alho lado a lado).</w:t>
+              <w:t xml:space="preserve">Prato fumegante com carne, farofa polvilhada por cima como tempero final, e o pão de alho Santa Massa em destaque ao lado.</w:t>
             </w:r>
           </w:p>
           <w:p>
@@ -3102,7 +3719,7 @@
               <w:rPr>
                 <w:color w:val="1A1A1A"/>
               </w:rPr>
-              <w:t xml:space="preserve">Corte para o prato pronto na mesa, com carne, farofa Santa Massa e pão de alho — still com vapor visível.</w:t>
+              <w:t xml:space="preserve">Corte para o prato pronto na mesa: carne com farofa Santa Massa polvilhada por cima e o pão de alho ao lado — still com vapor visível.</w:t>
             </w:r>
           </w:p>
           <w:p>
@@ -3134,7 +3751,7 @@
               <w:rPr>
                 <w:color w:val="1A1A1A"/>
               </w:rPr>
-              <w:t xml:space="preserve">Fecha com a pessoa se acomodando pra uma sesteada depois de comer.</w:t>
+              <w:t xml:space="preserve">Fecha com a pessoa se acomodando para uma sesteada — "ficou bem faceiro depois dessa".</w:t>
             </w:r>
           </w:p>
           <w:p>
@@ -3168,6 +3785,22 @@
           </w:p>
           <w:p>
             <w:pPr>
+              <w:pStyle w:val="ListParagraph"/>
+              <w:numPr>
+                <w:ilvl w:val="0"/>
+                <w:numId w:val="2"/>
+              </w:numPr>
+              <w:spacing w:after="60"/>
+            </w:pPr>
+            <w:r>
+              <w:rPr>
+                <w:color w:val="1A1A1A"/>
+              </w:rPr>
+              <w:t xml:space="preserve">"E FICOU BEM FACEIRO."</w:t>
+            </w:r>
+          </w:p>
+          <w:p>
+            <w:pPr>
               <w:spacing w:before="60"/>
             </w:pPr>
             <w:r>
@@ -3178,7 +3811,7 @@
               <w:t xml:space="preserve">Texto no vídeo: </w:t>
             </w:r>
             <w:r>
-              <w:t xml:space="preserve">TRABALHOU, COMEU BEM, AGORA É HORA DA SESTEADA.</w:t>
+              <w:t xml:space="preserve">TRABALHOU, COMEU BEM, AGORA É HORA DA SESTEADA. E FICOU BEM FACEIRO.</w:t>
             </w:r>
           </w:p>
         </w:tc>
@@ -3249,7 +3882,7 @@
           <w:iCs/>
           <w:color w:val="555555"/>
         </w:rPr>
-        <w:t xml:space="preserve">Observação geral: como nenhuma gravação ocorrerá no Acampamento Farroupilha, todos os roteiros acima foram desenhados para ambientes domésticos ou espaços públicos simples, sem elenco fixo em traje típico e sem figuração de desfile. Cada vídeo usa uma ocasião de consumo diferente para evitar repetição, mantendo sempre o apetite appeal do produto em primeiro plano.</w:t>
+        <w:t xml:space="preserve">Observação geral: como nenhuma gravação ocorrerá no Acampamento Farroupilha, todos os roteiros acima foram desenhados para ambientes domésticos ou espaços públicos simples, sem elenco fixo em traje típico e sem figuração de desfile. O pão de alho é o protagonista visual em todos os vídeos; a farofa, quando aparece, é sempre mostrada em seu uso correto — como tempero da carne.</w:t>
       </w:r>
     </w:p>
     <w:sectPr>

</xml_diff>

<commit_message>
Troca roteiro de bocha por piquenique na Redencao e adapta roteiro da sesteada para apartamento
</commit_message>
<xml_diff>
--- a/Roteiro_Situacoes_Tipicas_Gauchas_Santa_Massa.docx
+++ b/Roteiro_Situacoes_Tipicas_Gauchas_Santa_Massa.docx
@@ -412,7 +412,7 @@
         <w:rPr>
           <w:color w:val="1A1A1A"/>
         </w:rPr>
-        <w:t xml:space="preserve">BRIGADIANO — Policial militar (referência à Brigada Militar do RS).</w:t>
+        <w:t xml:space="preserve">TRI — Muito, bastante — intensificador usado o tempo todo ("tri bom", "tri legal").</w:t>
       </w:r>
     </w:p>
     <w:p>
@@ -2260,7 +2260,7 @@
                 <w:bCs/>
                 <w:color w:val="1A1A1A"/>
               </w:rPr>
-              <w:t xml:space="preserve">VÍDEO 5: Depois do Jogo de Bocha</w:t>
+              <w:t xml:space="preserve">VÍDEO 5: Piquenique de Sol na Redenção</w:t>
             </w:r>
           </w:p>
         </w:tc>
@@ -2402,7 +2402,7 @@
                 <w:bCs/>
                 <w:color w:val="1A1A1A"/>
               </w:rPr>
-              <w:t xml:space="preserve">Farofa Santa Massa (usada como tempero/acompanhamento polvilhado sobre a carne — não é um prato à parte)</w:t>
+              <w:t xml:space="preserve">Farofa Santa Massa (usada como tempero/acompanhamento polvilhado sobre a carne fria do piquenique — não é um prato à parte)</w:t>
             </w:r>
           </w:p>
         </w:tc>
@@ -2433,7 +2433,7 @@
               <w:rPr>
                 <w:color w:val="1A1A1A"/>
               </w:rPr>
-              <w:t xml:space="preserve">Fim de tarde de bocha no quintal/CTG com amigos — todo mundo chega faminto depois da partida, e a churrasqueira já tá pronta.</w:t>
+              <w:t xml:space="preserve">Domingo de sol no Parque da Redenção (Parque Farroupilha) — piquenique em família ou com amigos, mate circulando na toalha estendida na grama.</w:t>
             </w:r>
           </w:p>
           <w:p>
@@ -2452,7 +2452,7 @@
               <w:rPr>
                 <w:color w:val="1A1A1A"/>
               </w:rPr>
-              <w:t xml:space="preserve">Pão de alho Santa Massa sendo fatiado à mesa; farofa sendo polvilhada por cima da carne recém-cortada como toque final, nunca sozinha no prato.</w:t>
+              <w:t xml:space="preserve">Pão de alho Santa Massa esquentando numa churrasqueira portátil/anafre, embrulhado num guardanapo, queijo escorrendo; farofa sendo polvilhada sobre fatias de carne fria trazidas na cesta.</w:t>
             </w:r>
           </w:p>
           <w:p>
@@ -2481,55 +2481,55 @@
               <w:rPr>
                 <w:color w:val="1A1A1A"/>
               </w:rPr>
-              <w:t xml:space="preserve">Plano geral de uma partida informal de bocha no quintal, risadas, disputa leve.</w:t>
-            </w:r>
-          </w:p>
-          <w:p>
-            <w:pPr>
-              <w:pStyle w:val="ListParagraph"/>
-              <w:numPr>
-                <w:ilvl w:val="0"/>
-                <w:numId w:val="2"/>
-              </w:numPr>
-              <w:spacing w:after="60"/>
-            </w:pPr>
-            <w:r>
-              <w:rPr>
-                <w:color w:val="1A1A1A"/>
-              </w:rPr>
-              <w:t xml:space="preserve">Um brigadiano (policial) passando na rua desacelera o passo, sentindo o cheiro do churrasco vindo do quintal — só a reação, sem diálogo, como piscadela para quem entende o termo.</w:t>
-            </w:r>
-          </w:p>
-          <w:p>
-            <w:pPr>
-              <w:pStyle w:val="ListParagraph"/>
-              <w:numPr>
-                <w:ilvl w:val="0"/>
-                <w:numId w:val="2"/>
-              </w:numPr>
-              <w:spacing w:after="60"/>
-            </w:pPr>
-            <w:r>
-              <w:rPr>
-                <w:color w:val="1A1A1A"/>
-              </w:rPr>
-              <w:t xml:space="preserve">Corte para a mesa: carne sendo fatiada, farofa Santa Massa sendo polvilhada por cima como tempero final.</w:t>
-            </w:r>
-          </w:p>
-          <w:p>
-            <w:pPr>
-              <w:pStyle w:val="ListParagraph"/>
-              <w:numPr>
-                <w:ilvl w:val="0"/>
-                <w:numId w:val="2"/>
-              </w:numPr>
-              <w:spacing w:after="60"/>
-            </w:pPr>
-            <w:r>
-              <w:rPr>
-                <w:color w:val="1A1A1A"/>
-              </w:rPr>
-              <w:t xml:space="preserve">Pão de alho Santa Massa servido ao lado — a peça que todo mundo pega primeiro.</w:t>
+              <w:t xml:space="preserve">Plano geral do parque num dia de sol: gente andando, pedalinho no lago, mate e toalha de piquenique estendida na grama.</w:t>
+            </w:r>
+          </w:p>
+          <w:p>
+            <w:pPr>
+              <w:pStyle w:val="ListParagraph"/>
+              <w:numPr>
+                <w:ilvl w:val="0"/>
+                <w:numId w:val="2"/>
+              </w:numPr>
+              <w:spacing w:after="60"/>
+            </w:pPr>
+            <w:r>
+              <w:rPr>
+                <w:color w:val="1A1A1A"/>
+              </w:rPr>
+              <w:t xml:space="preserve">Uma pequena churrasqueira portátil/anafre é aberta, o pão de alho Santa Massa esquentando ali, vapor subindo ao sol.</w:t>
+            </w:r>
+          </w:p>
+          <w:p>
+            <w:pPr>
+              <w:pStyle w:val="ListParagraph"/>
+              <w:numPr>
+                <w:ilvl w:val="0"/>
+                <w:numId w:val="2"/>
+              </w:numPr>
+              <w:spacing w:after="60"/>
+            </w:pPr>
+            <w:r>
+              <w:rPr>
+                <w:color w:val="1A1A1A"/>
+              </w:rPr>
+              <w:t xml:space="preserve">Farofa Santa Massa sendo polvilhada sobre fatias de carne fria dispostas na cesta de piquenique.</w:t>
+            </w:r>
+          </w:p>
+          <w:p>
+            <w:pPr>
+              <w:pStyle w:val="ListParagraph"/>
+              <w:numPr>
+                <w:ilvl w:val="0"/>
+                <w:numId w:val="2"/>
+              </w:numPr>
+              <w:spacing w:after="60"/>
+            </w:pPr>
+            <w:r>
+              <w:rPr>
+                <w:color w:val="1A1A1A"/>
+              </w:rPr>
+              <w:t xml:space="preserve">Grupo sentado na grama, sol batendo, todo mundo comendo enquanto o mate continua circulando ao mesmo tempo.</w:t>
             </w:r>
           </w:p>
           <w:p>
@@ -2558,7 +2558,23 @@
               <w:rPr>
                 <w:color w:val="1A1A1A"/>
               </w:rPr>
-              <w:t xml:space="preserve">"NEM O BRIGADIANO RESISTE AO CHEIRO."</w:t>
+              <w:t xml:space="preserve">"DOMINGO DE SOL NA REDENÇÃO JÁ É TRI BOM."</w:t>
+            </w:r>
+          </w:p>
+          <w:p>
+            <w:pPr>
+              <w:pStyle w:val="ListParagraph"/>
+              <w:numPr>
+                <w:ilvl w:val="0"/>
+                <w:numId w:val="2"/>
+              </w:numPr>
+              <w:spacing w:after="60"/>
+            </w:pPr>
+            <w:r>
+              <w:rPr>
+                <w:color w:val="1A1A1A"/>
+              </w:rPr>
+              <w:t xml:space="preserve">"COM PÃO DE ALHO, FICA MELHOR AINDA."</w:t>
             </w:r>
           </w:p>
           <w:p>
@@ -2573,7 +2589,7 @@
               <w:t xml:space="preserve">Texto no vídeo: </w:t>
             </w:r>
             <w:r>
-              <w:t xml:space="preserve">NEM O BRIGADIANO RESISTE AO CHEIRO.</w:t>
+              <w:t xml:space="preserve">DOMINGO DE SOL NA REDENÇÃO JÁ É TRI BOM. COM PÃO DE ALHO, FICA MELHOR AINDA.</w:t>
             </w:r>
           </w:p>
         </w:tc>
@@ -2598,7 +2614,7 @@
                 <w:iCs/>
                 <w:color w:val="555555"/>
               </w:rPr>
-              <w:t xml:space="preserve">Buscar referência: Reels de jogos de quintal entre amigos (bocha, taba, buraco) seguidos de churrasco — bom gancho de comunidade/lazer.</w:t>
+              <w:t xml:space="preserve">Buscar referência: Reels de piquenique em parque urbano — toalha na grama, cesta, plano aberto do parque intercalado com closes da comida.</w:t>
             </w:r>
           </w:p>
         </w:tc>
@@ -2623,7 +2639,7 @@
                 <w:iCs/>
                 <w:color w:val="555555"/>
               </w:rPr>
-              <w:t xml:space="preserve">Contraste entre o esforço físico do jogo e o momento de fartura à mesa; farofa mostrada apenas como toque final sobre a carne.</w:t>
+              <w:t xml:space="preserve">Luz de sol direta, verde do parque ao fundo, contraste entre o plano aberto (parque cheio de gente) e o close no produto.</w:t>
             </w:r>
           </w:p>
         </w:tc>
@@ -3482,7 +3498,7 @@
                 <w:bCs/>
                 <w:color w:val="1A1A1A"/>
               </w:rPr>
-              <w:t xml:space="preserve">VÍDEO 8: Depois da Lida no Quintal</w:t>
+              <w:t xml:space="preserve">VÍDEO 8: Depois da Lida no Apê</w:t>
             </w:r>
           </w:p>
         </w:tc>
@@ -3655,7 +3671,7 @@
               <w:rPr>
                 <w:color w:val="1A1A1A"/>
               </w:rPr>
-              <w:t xml:space="preserve">Final de tarde após um esforço físico leve em casa (cuidar da horta, cortar grama, arrumar o quintal) — a recompensa de uma refeição completa.</w:t>
+              <w:t xml:space="preserve">Fim de tarde de sábado num apartamento, depois de organizar a casa — a recompensa de uma refeição completa na churrasqueira de sacada.</w:t>
             </w:r>
           </w:p>
           <w:p>
@@ -3674,7 +3690,7 @@
               <w:rPr>
                 <w:color w:val="1A1A1A"/>
               </w:rPr>
-              <w:t xml:space="preserve">Prato fumegante com carne, farofa polvilhada por cima como tempero final, e o pão de alho Santa Massa em destaque ao lado.</w:t>
+              <w:t xml:space="preserve">Prato fumegante com carne, farofa polvilhada por cima como tempero final, e o pão de alho Santa Massa em destaque ao lado, tudo saindo da churrasqueira de sacada.</w:t>
             </w:r>
           </w:p>
           <w:p>
@@ -3703,23 +3719,55 @@
               <w:rPr>
                 <w:color w:val="1A1A1A"/>
               </w:rPr>
-              <w:t xml:space="preserve">Alguém terminando uma tarefa no quintal (regar plantas, guardar ferramentas), visivelmente cansado mas satisfeito.</w:t>
-            </w:r>
-          </w:p>
-          <w:p>
-            <w:pPr>
-              <w:pStyle w:val="ListParagraph"/>
-              <w:numPr>
-                <w:ilvl w:val="0"/>
-                <w:numId w:val="2"/>
-              </w:numPr>
-              <w:spacing w:after="60"/>
-            </w:pPr>
-            <w:r>
-              <w:rPr>
-                <w:color w:val="1A1A1A"/>
-              </w:rPr>
-              <w:t xml:space="preserve">Corte para o prato pronto na mesa: carne com farofa Santa Massa polvilhada por cima e o pão de alho ao lado — still com vapor visível.</w:t>
+              <w:t xml:space="preserve">Alguém organizando o apê num sábado (guardando roupa, regando os vasos da varanda, tirando o pó), visivelmente cansado mas satisfeito.</w:t>
+            </w:r>
+          </w:p>
+          <w:p>
+            <w:pPr>
+              <w:pStyle w:val="ListParagraph"/>
+              <w:numPr>
+                <w:ilvl w:val="0"/>
+                <w:numId w:val="2"/>
+              </w:numPr>
+              <w:spacing w:after="60"/>
+            </w:pPr>
+            <w:r>
+              <w:rPr>
+                <w:color w:val="1A1A1A"/>
+              </w:rPr>
+              <w:t xml:space="preserve">Corte para a churrasqueira de sacada — item clássico dos apês gaúchos — com a carne grelhando.</w:t>
+            </w:r>
+          </w:p>
+          <w:p>
+            <w:pPr>
+              <w:pStyle w:val="ListParagraph"/>
+              <w:numPr>
+                <w:ilvl w:val="0"/>
+                <w:numId w:val="2"/>
+              </w:numPr>
+              <w:spacing w:after="60"/>
+            </w:pPr>
+            <w:r>
+              <w:rPr>
+                <w:color w:val="1A1A1A"/>
+              </w:rPr>
+              <w:t xml:space="preserve">Farofa Santa Massa polvilhada sobre a carne já fatiada; pão de alho Santa Massa grelhando ao lado, na mesma churrasqueira.</w:t>
+            </w:r>
+          </w:p>
+          <w:p>
+            <w:pPr>
+              <w:pStyle w:val="ListParagraph"/>
+              <w:numPr>
+                <w:ilvl w:val="0"/>
+                <w:numId w:val="2"/>
+              </w:numPr>
+              <w:spacing w:after="60"/>
+            </w:pPr>
+            <w:r>
+              <w:rPr>
+                <w:color w:val="1A1A1A"/>
+              </w:rPr>
+              <w:t xml:space="preserve">Prato pronto levado até o sofá da sala — still com vapor visível.</w:t>
             </w:r>
           </w:p>
           <w:p>
@@ -3751,7 +3799,7 @@
               <w:rPr>
                 <w:color w:val="1A1A1A"/>
               </w:rPr>
-              <w:t xml:space="preserve">Fecha com a pessoa se acomodando para uma sesteada — "ficou bem faceiro depois dessa".</w:t>
+              <w:t xml:space="preserve">Fecha com a pessoa se acomodando no sofá para uma sesteada — "ficou bem faceiro depois dessa".</w:t>
             </w:r>
           </w:p>
           <w:p>
@@ -3780,6 +3828,22 @@
               <w:rPr>
                 <w:color w:val="1A1A1A"/>
               </w:rPr>
+              <w:t xml:space="preserve">"TODO APÊ GAÚCHO TEM UMA CHURRASQUEIRA NA SACADA."</w:t>
+            </w:r>
+          </w:p>
+          <w:p>
+            <w:pPr>
+              <w:pStyle w:val="ListParagraph"/>
+              <w:numPr>
+                <w:ilvl w:val="0"/>
+                <w:numId w:val="2"/>
+              </w:numPr>
+              <w:spacing w:after="60"/>
+            </w:pPr>
+            <w:r>
+              <w:rPr>
+                <w:color w:val="1A1A1A"/>
+              </w:rPr>
               <w:t xml:space="preserve">"TRABALHOU, COMEU BEM, AGORA É HORA DA SESTEADA."</w:t>
             </w:r>
           </w:p>
@@ -3811,7 +3875,7 @@
               <w:t xml:space="preserve">Texto no vídeo: </w:t>
             </w:r>
             <w:r>
-              <w:t xml:space="preserve">TRABALHOU, COMEU BEM, AGORA É HORA DA SESTEADA. E FICOU BEM FACEIRO.</w:t>
+              <w:t xml:space="preserve">TODO APÊ GAÚCHO TEM UMA CHURRASQUEIRA NA SACADA. TRABALHOU, COMEU BEM, AGORA É HORA DA SESTEADA. E FICOU BEM FACEIRO.</w:t>
             </w:r>
           </w:p>
         </w:tc>
@@ -3836,7 +3900,7 @@
                 <w:iCs/>
                 <w:color w:val="555555"/>
               </w:rPr>
-              <w:t xml:space="preserve">Buscar referência: Reels de "recompensa depois do esforço físico" — rotina doméstica seguida de refeição farta.</w:t>
+              <w:t xml:space="preserve">Buscar referência: Reels de "recompensa depois do esforço físico" em ambiente de apartamento — rotina doméstica seguida de refeição na varanda/sacada.</w:t>
             </w:r>
           </w:p>
         </w:tc>
@@ -3861,7 +3925,7 @@
                 <w:iCs/>
                 <w:color w:val="555555"/>
               </w:rPr>
-              <w:t xml:space="preserve">Transição de esforço (suor, cansaço) para conforto (mesa farta, prato fumegante, corpo relaxando).</w:t>
+              <w:t xml:space="preserve">Transição de esforço (suor, cansaço, casa sendo organizada) para conforto (churrasqueira de sacada, prato fumegante, sofá).</w:t>
             </w:r>
           </w:p>
         </w:tc>

</xml_diff>